<commit_message>
commit dia de hoy
</commit_message>
<xml_diff>
--- a/2ºDAW/DAW/2ºTrimestre/Unidad 4/Ejercicios/actividad4.4-SuárezGarcíaPablo.docx
+++ b/2ºDAW/DAW/2ºTrimestre/Unidad 4/Ejercicios/actividad4.4-SuárezGarcíaPablo.docx
@@ -290,7 +290,7 @@
                     <pic:cNvPicPr/>
                   </pic:nvPicPr>
                   <pic:blipFill>
-                    <a:blip r:embed="rId7"/>
+                    <a:blip r:embed="rId8"/>
                     <a:stretch>
                       <a:fillRect/>
                     </a:stretch>
@@ -362,81 +362,6 @@
             <wp:extent cx="5400040" cy="1023620"/>
             <wp:effectExtent l="0" t="0" r="0" b="5080"/>
             <wp:docPr id="19" name="Imagen 19"/>
-            <wp:cNvGraphicFramePr>
-              <a:graphicFrameLocks xmlns:a="http://schemas.openxmlformats.org/drawingml/2006/main" noChangeAspect="1"/>
-            </wp:cNvGraphicFramePr>
-            <a:graphic xmlns:a="http://schemas.openxmlformats.org/drawingml/2006/main">
-              <a:graphicData uri="http://schemas.openxmlformats.org/drawingml/2006/picture">
-                <pic:pic xmlns:pic="http://schemas.openxmlformats.org/drawingml/2006/picture">
-                  <pic:nvPicPr>
-                    <pic:cNvPr id="1" name=""/>
-                    <pic:cNvPicPr/>
-                  </pic:nvPicPr>
-                  <pic:blipFill>
-                    <a:blip r:embed="rId8"/>
-                    <a:stretch>
-                      <a:fillRect/>
-                    </a:stretch>
-                  </pic:blipFill>
-                  <pic:spPr>
-                    <a:xfrm>
-                      <a:off x="0" y="0"/>
-                      <a:ext cx="5400040" cy="1023620"/>
-                    </a:xfrm>
-                    <a:prstGeom prst="rect">
-                      <a:avLst/>
-                    </a:prstGeom>
-                  </pic:spPr>
-                </pic:pic>
-              </a:graphicData>
-            </a:graphic>
-          </wp:inline>
-        </w:drawing>
-      </w:r>
-    </w:p>
-    <w:p>
-      <w:pPr>
-        <w:rPr>
-          <w:b/>
-          <w:bCs/>
-        </w:rPr>
-      </w:pPr>
-      <w:r>
-        <w:rPr>
-          <w:b/>
-          <w:bCs/>
-        </w:rPr>
-        <w:t>Ejecución de una imagen:</w:t>
-      </w:r>
-    </w:p>
-    <w:p>
-      <w:r>
-        <w:t xml:space="preserve">sudo </w:t>
-      </w:r>
-      <w:proofErr w:type="spellStart"/>
-      <w:r>
-        <w:t>docker</w:t>
-      </w:r>
-      <w:proofErr w:type="spellEnd"/>
-      <w:r>
-        <w:t xml:space="preserve"> run </w:t>
-      </w:r>
-      <w:proofErr w:type="spellStart"/>
-      <w:r>
-        <w:t>hello-world</w:t>
-      </w:r>
-      <w:proofErr w:type="spellEnd"/>
-    </w:p>
-    <w:p>
-      <w:r>
-        <w:rPr>
-          <w:noProof/>
-        </w:rPr>
-        <w:drawing>
-          <wp:inline distT="0" distB="0" distL="0" distR="0" wp14:anchorId="5887BCC3" wp14:editId="669D5496">
-            <wp:extent cx="5381625" cy="3219862"/>
-            <wp:effectExtent l="0" t="0" r="0" b="0"/>
-            <wp:docPr id="20" name="Imagen 20"/>
             <wp:cNvGraphicFramePr>
               <a:graphicFrameLocks xmlns:a="http://schemas.openxmlformats.org/drawingml/2006/main" noChangeAspect="1"/>
             </wp:cNvGraphicFramePr>
@@ -456,7 +381,7 @@
                   <pic:spPr>
                     <a:xfrm>
                       <a:off x="0" y="0"/>
-                      <a:ext cx="5385562" cy="3222217"/>
+                      <a:ext cx="5400040" cy="1023620"/>
                     </a:xfrm>
                     <a:prstGeom prst="rect">
                       <a:avLst/>
@@ -481,84 +406,26 @@
           <w:b/>
           <w:bCs/>
         </w:rPr>
-        <w:t xml:space="preserve">Uso de </w:t>
-      </w:r>
-      <w:proofErr w:type="spellStart"/>
-      <w:r>
-        <w:rPr>
-          <w:b/>
-          <w:bCs/>
-        </w:rPr>
+        <w:t>Ejecución de una imagen:</w:t>
+      </w:r>
+    </w:p>
+    <w:p>
+      <w:r>
+        <w:t xml:space="preserve">sudo </w:t>
+      </w:r>
+      <w:proofErr w:type="spellStart"/>
+      <w:r>
         <w:t>docker</w:t>
       </w:r>
       <w:proofErr w:type="spellEnd"/>
       <w:r>
-        <w:rPr>
-          <w:b/>
-          <w:bCs/>
-        </w:rPr>
-        <w:t xml:space="preserve"> sin ser </w:t>
-      </w:r>
-      <w:proofErr w:type="spellStart"/>
-      <w:r>
-        <w:rPr>
-          <w:b/>
-          <w:bCs/>
-        </w:rPr>
-        <w:t>root</w:t>
-      </w:r>
-      <w:proofErr w:type="spellEnd"/>
-      <w:r>
-        <w:rPr>
-          <w:b/>
-          <w:bCs/>
-        </w:rPr>
-        <w:t xml:space="preserve">. se añade el usuario de Ubuntu dentro del grupo </w:t>
-      </w:r>
-      <w:proofErr w:type="spellStart"/>
-      <w:r>
-        <w:rPr>
-          <w:b/>
-          <w:bCs/>
-        </w:rPr>
-        <w:t>docker</w:t>
-      </w:r>
-      <w:proofErr w:type="spellEnd"/>
-    </w:p>
-    <w:p>
-      <w:r>
-        <w:t xml:space="preserve">sudo </w:t>
-      </w:r>
-      <w:proofErr w:type="spellStart"/>
-      <w:r>
-        <w:t>usermod</w:t>
-      </w:r>
-      <w:proofErr w:type="spellEnd"/>
-      <w:r>
-        <w:t xml:space="preserve"> -</w:t>
-      </w:r>
-      <w:proofErr w:type="spellStart"/>
-      <w:r>
-        <w:t>aG</w:t>
-      </w:r>
-      <w:proofErr w:type="spellEnd"/>
-      <w:r>
-        <w:t xml:space="preserve"> </w:t>
-      </w:r>
-      <w:proofErr w:type="spellStart"/>
-      <w:r>
-        <w:t>docker</w:t>
-      </w:r>
-      <w:proofErr w:type="spellEnd"/>
-      <w:r>
-        <w:t xml:space="preserve"> p</w:t>
-      </w:r>
-      <w:r>
-        <w:t>ablosg2526</w:t>
-      </w:r>
-      <w:r>
-        <w:t xml:space="preserve"> (hay que cerrar la sesión y volver a entrar para que funcione; si no va, reiniciar Ubuntu)</w:t>
-      </w:r>
+        <w:t xml:space="preserve"> run </w:t>
+      </w:r>
+      <w:proofErr w:type="spellStart"/>
+      <w:r>
+        <w:t>hello-world</w:t>
+      </w:r>
+      <w:proofErr w:type="spellEnd"/>
     </w:p>
     <w:p>
       <w:r>
@@ -566,10 +433,10 @@
           <w:noProof/>
         </w:rPr>
         <w:drawing>
-          <wp:inline distT="0" distB="0" distL="0" distR="0" wp14:anchorId="576F9F06" wp14:editId="48506E6C">
-            <wp:extent cx="5400040" cy="166370"/>
-            <wp:effectExtent l="0" t="0" r="0" b="5080"/>
-            <wp:docPr id="25" name="Imagen 25"/>
+          <wp:inline distT="0" distB="0" distL="0" distR="0" wp14:anchorId="5887BCC3" wp14:editId="669D5496">
+            <wp:extent cx="5381625" cy="3219862"/>
+            <wp:effectExtent l="0" t="0" r="0" b="0"/>
+            <wp:docPr id="20" name="Imagen 20"/>
             <wp:cNvGraphicFramePr>
               <a:graphicFrameLocks xmlns:a="http://schemas.openxmlformats.org/drawingml/2006/main" noChangeAspect="1"/>
             </wp:cNvGraphicFramePr>
@@ -589,7 +456,7 @@
                   <pic:spPr>
                     <a:xfrm>
                       <a:off x="0" y="0"/>
-                      <a:ext cx="5400040" cy="166370"/>
+                      <a:ext cx="5385562" cy="3222217"/>
                     </a:xfrm>
                     <a:prstGeom prst="rect">
                       <a:avLst/>
@@ -614,7 +481,7 @@
           <w:b/>
           <w:bCs/>
         </w:rPr>
-        <w:t xml:space="preserve">Versión de </w:t>
+        <w:t xml:space="preserve">Uso de </w:t>
       </w:r>
       <w:proofErr w:type="spellStart"/>
       <w:r>
@@ -630,8 +497,33 @@
           <w:b/>
           <w:bCs/>
         </w:rPr>
-        <w:t xml:space="preserve"> instalada</w:t>
-      </w:r>
+        <w:t xml:space="preserve"> sin ser </w:t>
+      </w:r>
+      <w:proofErr w:type="spellStart"/>
+      <w:r>
+        <w:rPr>
+          <w:b/>
+          <w:bCs/>
+        </w:rPr>
+        <w:t>root</w:t>
+      </w:r>
+      <w:proofErr w:type="spellEnd"/>
+      <w:r>
+        <w:rPr>
+          <w:b/>
+          <w:bCs/>
+        </w:rPr>
+        <w:t xml:space="preserve">. se añade el usuario de Ubuntu dentro del grupo </w:t>
+      </w:r>
+      <w:proofErr w:type="spellStart"/>
+      <w:r>
+        <w:rPr>
+          <w:b/>
+          <w:bCs/>
+        </w:rPr>
+        <w:t>docker</w:t>
+      </w:r>
+      <w:proofErr w:type="spellEnd"/>
     </w:p>
     <w:p>
       <w:r>
@@ -639,29 +531,45 @@
       </w:r>
       <w:proofErr w:type="spellStart"/>
       <w:r>
+        <w:t>usermod</w:t>
+      </w:r>
+      <w:proofErr w:type="spellEnd"/>
+      <w:r>
+        <w:t xml:space="preserve"> -</w:t>
+      </w:r>
+      <w:proofErr w:type="spellStart"/>
+      <w:r>
+        <w:t>aG</w:t>
+      </w:r>
+      <w:proofErr w:type="spellEnd"/>
+      <w:r>
+        <w:t xml:space="preserve"> </w:t>
+      </w:r>
+      <w:proofErr w:type="spellStart"/>
+      <w:r>
         <w:t>docker</w:t>
       </w:r>
       <w:proofErr w:type="spellEnd"/>
       <w:r>
-        <w:t xml:space="preserve"> </w:t>
-      </w:r>
-      <w:proofErr w:type="spellStart"/>
-      <w:r>
-        <w:t>version</w:t>
-      </w:r>
-      <w:proofErr w:type="spellEnd"/>
+        <w:t xml:space="preserve"> p</w:t>
+      </w:r>
+      <w:r>
+        <w:t>ablosg2526</w:t>
+      </w:r>
+      <w:r>
+        <w:t xml:space="preserve"> (hay que cerrar la sesión y volver a entrar para que funcione; si no va, reiniciar Ubuntu)</w:t>
+      </w:r>
     </w:p>
     <w:p>
       <w:r>
         <w:rPr>
           <w:noProof/>
         </w:rPr>
-        <w:lastRenderedPageBreak/>
         <w:drawing>
-          <wp:inline distT="0" distB="0" distL="0" distR="0" wp14:anchorId="45162373" wp14:editId="07AB8AC5">
-            <wp:extent cx="4265446" cy="3790950"/>
-            <wp:effectExtent l="0" t="0" r="1905" b="0"/>
-            <wp:docPr id="21" name="Imagen 21"/>
+          <wp:inline distT="0" distB="0" distL="0" distR="0" wp14:anchorId="576F9F06" wp14:editId="48506E6C">
+            <wp:extent cx="5400040" cy="166370"/>
+            <wp:effectExtent l="0" t="0" r="0" b="5080"/>
+            <wp:docPr id="25" name="Imagen 25"/>
             <wp:cNvGraphicFramePr>
               <a:graphicFrameLocks xmlns:a="http://schemas.openxmlformats.org/drawingml/2006/main" noChangeAspect="1"/>
             </wp:cNvGraphicFramePr>
@@ -681,7 +589,7 @@
                   <pic:spPr>
                     <a:xfrm>
                       <a:off x="0" y="0"/>
-                      <a:ext cx="4273431" cy="3798047"/>
+                      <a:ext cx="5400040" cy="166370"/>
                     </a:xfrm>
                     <a:prstGeom prst="rect">
                       <a:avLst/>
@@ -706,7 +614,7 @@
           <w:b/>
           <w:bCs/>
         </w:rPr>
-        <w:t xml:space="preserve">Información sobre </w:t>
+        <w:t xml:space="preserve">Versión de </w:t>
       </w:r>
       <w:proofErr w:type="spellStart"/>
       <w:r>
@@ -717,6 +625,13 @@
         <w:t>docker</w:t>
       </w:r>
       <w:proofErr w:type="spellEnd"/>
+      <w:r>
+        <w:rPr>
+          <w:b/>
+          <w:bCs/>
+        </w:rPr>
+        <w:t xml:space="preserve"> instalada</w:t>
+      </w:r>
     </w:p>
     <w:p>
       <w:r>
@@ -732,7 +647,7 @@
       </w:r>
       <w:proofErr w:type="spellStart"/>
       <w:r>
-        <w:t>info</w:t>
+        <w:t>version</w:t>
       </w:r>
       <w:proofErr w:type="spellEnd"/>
     </w:p>
@@ -741,11 +656,12 @@
         <w:rPr>
           <w:noProof/>
         </w:rPr>
+        <w:lastRenderedPageBreak/>
         <w:drawing>
-          <wp:inline distT="0" distB="0" distL="0" distR="0" wp14:anchorId="67185367" wp14:editId="22B57E3D">
-            <wp:extent cx="4218940" cy="3667263"/>
-            <wp:effectExtent l="0" t="0" r="0" b="9525"/>
-            <wp:docPr id="23" name="Imagen 23"/>
+          <wp:inline distT="0" distB="0" distL="0" distR="0" wp14:anchorId="45162373" wp14:editId="07AB8AC5">
+            <wp:extent cx="4265446" cy="3790950"/>
+            <wp:effectExtent l="0" t="0" r="1905" b="0"/>
+            <wp:docPr id="21" name="Imagen 21"/>
             <wp:cNvGraphicFramePr>
               <a:graphicFrameLocks xmlns:a="http://schemas.openxmlformats.org/drawingml/2006/main" noChangeAspect="1"/>
             </wp:cNvGraphicFramePr>
@@ -765,7 +681,7 @@
                   <pic:spPr>
                     <a:xfrm>
                       <a:off x="0" y="0"/>
-                      <a:ext cx="4224094" cy="3671743"/>
+                      <a:ext cx="4273431" cy="3798047"/>
                     </a:xfrm>
                     <a:prstGeom prst="rect">
                       <a:avLst/>
@@ -779,16 +695,57 @@
       </w:r>
     </w:p>
     <w:p>
+      <w:pPr>
+        <w:rPr>
+          <w:b/>
+          <w:bCs/>
+        </w:rPr>
+      </w:pPr>
+      <w:r>
+        <w:rPr>
+          <w:b/>
+          <w:bCs/>
+        </w:rPr>
+        <w:t xml:space="preserve">Información sobre </w:t>
+      </w:r>
+      <w:proofErr w:type="spellStart"/>
+      <w:r>
+        <w:rPr>
+          <w:b/>
+          <w:bCs/>
+        </w:rPr>
+        <w:t>docker</w:t>
+      </w:r>
+      <w:proofErr w:type="spellEnd"/>
+    </w:p>
+    <w:p>
+      <w:r>
+        <w:t xml:space="preserve">sudo </w:t>
+      </w:r>
+      <w:proofErr w:type="spellStart"/>
+      <w:r>
+        <w:t>docker</w:t>
+      </w:r>
+      <w:proofErr w:type="spellEnd"/>
+      <w:r>
+        <w:t xml:space="preserve"> </w:t>
+      </w:r>
+      <w:proofErr w:type="spellStart"/>
+      <w:r>
+        <w:t>info</w:t>
+      </w:r>
+      <w:proofErr w:type="spellEnd"/>
+    </w:p>
+    <w:p>
       <w:r>
         <w:rPr>
           <w:noProof/>
         </w:rPr>
-        <w:lastRenderedPageBreak/>
         <w:drawing>
-          <wp:inline distT="0" distB="0" distL="0" distR="0" wp14:anchorId="6D888936" wp14:editId="1401ABF3">
-            <wp:extent cx="3981450" cy="3988663"/>
-            <wp:effectExtent l="0" t="0" r="0" b="0"/>
-            <wp:docPr id="24" name="Imagen 24"/>
+          <wp:inline distT="0" distB="0" distL="0" distR="0" wp14:anchorId="67185367" wp14:editId="22B57E3D">
+            <wp:extent cx="4218940" cy="3667263"/>
+            <wp:effectExtent l="0" t="0" r="0" b="9525"/>
+            <wp:docPr id="23" name="Imagen 23"/>
             <wp:cNvGraphicFramePr>
               <a:graphicFrameLocks xmlns:a="http://schemas.openxmlformats.org/drawingml/2006/main" noChangeAspect="1"/>
             </wp:cNvGraphicFramePr>
@@ -808,7 +765,7 @@
                   <pic:spPr>
                     <a:xfrm>
                       <a:off x="0" y="0"/>
-                      <a:ext cx="3994925" cy="4002163"/>
+                      <a:ext cx="4224094" cy="3671743"/>
                     </a:xfrm>
                     <a:prstGeom prst="rect">
                       <a:avLst/>
@@ -822,53 +779,16 @@
       </w:r>
     </w:p>
     <w:p>
-      <w:pPr>
-        <w:rPr>
-          <w:b/>
-          <w:bCs/>
-        </w:rPr>
-      </w:pPr>
-      <w:r>
-        <w:rPr>
-          <w:b/>
-          <w:bCs/>
-        </w:rPr>
-        <w:t>Búsqueda de una imagen en hub.docker.com</w:t>
-      </w:r>
-    </w:p>
-    <w:p>
-      <w:proofErr w:type="spellStart"/>
-      <w:r>
-        <w:t>docker</w:t>
-      </w:r>
-      <w:proofErr w:type="spellEnd"/>
-      <w:r>
-        <w:t xml:space="preserve"> </w:t>
-      </w:r>
-      <w:proofErr w:type="spellStart"/>
-      <w:r>
-        <w:t>search</w:t>
-      </w:r>
-      <w:proofErr w:type="spellEnd"/>
-      <w:r>
-        <w:t xml:space="preserve"> </w:t>
-      </w:r>
-      <w:proofErr w:type="spellStart"/>
-      <w:r>
-        <w:t>httpd</w:t>
-      </w:r>
-      <w:proofErr w:type="spellEnd"/>
-    </w:p>
-    <w:p>
       <w:r>
         <w:rPr>
           <w:noProof/>
         </w:rPr>
+        <w:lastRenderedPageBreak/>
         <w:drawing>
-          <wp:inline distT="0" distB="0" distL="0" distR="0" wp14:anchorId="43B44CB3" wp14:editId="17908C68">
-            <wp:extent cx="4362450" cy="2519797"/>
-            <wp:effectExtent l="0" t="0" r="0" b="0"/>
-            <wp:docPr id="26" name="Imagen 26"/>
+          <wp:inline distT="0" distB="0" distL="0" distR="0" wp14:anchorId="6D888936" wp14:editId="1CA06D3E">
+            <wp:extent cx="3061504" cy="3067050"/>
+            <wp:effectExtent l="0" t="0" r="5715" b="0"/>
+            <wp:docPr id="24" name="Imagen 24"/>
             <wp:cNvGraphicFramePr>
               <a:graphicFrameLocks xmlns:a="http://schemas.openxmlformats.org/drawingml/2006/main" noChangeAspect="1"/>
             </wp:cNvGraphicFramePr>
@@ -888,7 +808,7 @@
                   <pic:spPr>
                     <a:xfrm>
                       <a:off x="0" y="0"/>
-                      <a:ext cx="4372476" cy="2525588"/>
+                      <a:ext cx="3083650" cy="3089236"/>
                     </a:xfrm>
                     <a:prstGeom prst="rect">
                       <a:avLst/>
@@ -913,7 +833,7 @@
           <w:b/>
           <w:bCs/>
         </w:rPr>
-        <w:t>Búsqueda con filtro:</w:t>
+        <w:t>Búsqueda de una imagen en hub.docker.com</w:t>
       </w:r>
     </w:p>
     <w:p>
@@ -931,20 +851,24 @@
       </w:r>
       <w:proofErr w:type="spellEnd"/>
       <w:r>
-        <w:t xml:space="preserve"> ubuntu:24.04</w:t>
-      </w:r>
+        <w:t xml:space="preserve"> </w:t>
+      </w:r>
+      <w:proofErr w:type="spellStart"/>
+      <w:r>
+        <w:t>httpd</w:t>
+      </w:r>
+      <w:proofErr w:type="spellEnd"/>
     </w:p>
     <w:p>
       <w:r>
         <w:rPr>
           <w:noProof/>
         </w:rPr>
-        <w:lastRenderedPageBreak/>
         <w:drawing>
-          <wp:inline distT="0" distB="0" distL="0" distR="0" wp14:anchorId="48219427" wp14:editId="7D626146">
-            <wp:extent cx="4123690" cy="2764482"/>
+          <wp:inline distT="0" distB="0" distL="0" distR="0" wp14:anchorId="43B44CB3" wp14:editId="5447D1C1">
+            <wp:extent cx="3265090" cy="1885950"/>
             <wp:effectExtent l="0" t="0" r="0" b="0"/>
-            <wp:docPr id="28" name="Imagen 28"/>
+            <wp:docPr id="26" name="Imagen 26"/>
             <wp:cNvGraphicFramePr>
               <a:graphicFrameLocks xmlns:a="http://schemas.openxmlformats.org/drawingml/2006/main" noChangeAspect="1"/>
             </wp:cNvGraphicFramePr>
@@ -964,7 +888,7 @@
                   <pic:spPr>
                     <a:xfrm>
                       <a:off x="0" y="0"/>
-                      <a:ext cx="4126599" cy="2766432"/>
+                      <a:ext cx="3274021" cy="1891108"/>
                     </a:xfrm>
                     <a:prstGeom prst="rect">
                       <a:avLst/>
@@ -989,33 +913,8 @@
           <w:b/>
           <w:bCs/>
         </w:rPr>
-        <w:t xml:space="preserve">Descargamos </w:t>
-      </w:r>
-      <w:proofErr w:type="spellStart"/>
-      <w:r>
-        <w:rPr>
-          <w:b/>
-          <w:bCs/>
-        </w:rPr>
-        <w:t>httpd</w:t>
-      </w:r>
-      <w:proofErr w:type="spellEnd"/>
-      <w:r>
-        <w:rPr>
-          <w:b/>
-          <w:bCs/>
-        </w:rPr>
-        <w:t xml:space="preserve"> y </w:t>
-      </w:r>
-      <w:proofErr w:type="spellStart"/>
-      <w:r>
-        <w:rPr>
-          <w:b/>
-          <w:bCs/>
-        </w:rPr>
-        <w:t>ubuntu</w:t>
-      </w:r>
-      <w:proofErr w:type="spellEnd"/>
+        <w:t>Búsqueda con filtro:</w:t>
+      </w:r>
     </w:p>
     <w:p>
       <w:proofErr w:type="spellStart"/>
@@ -1028,17 +927,12 @@
       </w:r>
       <w:proofErr w:type="spellStart"/>
       <w:r>
-        <w:t>pull</w:t>
-      </w:r>
-      <w:proofErr w:type="spellEnd"/>
-      <w:r>
-        <w:t xml:space="preserve"> </w:t>
-      </w:r>
-      <w:proofErr w:type="spellStart"/>
-      <w:r>
-        <w:t>httpd</w:t>
-      </w:r>
-      <w:proofErr w:type="spellEnd"/>
+        <w:t>search</w:t>
+      </w:r>
+      <w:proofErr w:type="spellEnd"/>
+      <w:r>
+        <w:t xml:space="preserve"> ubuntu:24.04</w:t>
+      </w:r>
     </w:p>
     <w:p>
       <w:r>
@@ -1046,10 +940,10 @@
           <w:noProof/>
         </w:rPr>
         <w:drawing>
-          <wp:inline distT="0" distB="0" distL="0" distR="0" wp14:anchorId="5F1B26B7" wp14:editId="0CD8B084">
-            <wp:extent cx="4305300" cy="1475770"/>
-            <wp:effectExtent l="0" t="0" r="0" b="0"/>
-            <wp:docPr id="27" name="Imagen 27"/>
+          <wp:inline distT="0" distB="0" distL="0" distR="0" wp14:anchorId="48219427" wp14:editId="658E829F">
+            <wp:extent cx="3370727" cy="2259703"/>
+            <wp:effectExtent l="0" t="0" r="1270" b="7620"/>
+            <wp:docPr id="28" name="Imagen 28"/>
             <wp:cNvGraphicFramePr>
               <a:graphicFrameLocks xmlns:a="http://schemas.openxmlformats.org/drawingml/2006/main" noChangeAspect="1"/>
             </wp:cNvGraphicFramePr>
@@ -1069,7 +963,7 @@
                   <pic:spPr>
                     <a:xfrm>
                       <a:off x="0" y="0"/>
-                      <a:ext cx="4309241" cy="1477121"/>
+                      <a:ext cx="3379441" cy="2265545"/>
                     </a:xfrm>
                     <a:prstGeom prst="rect">
                       <a:avLst/>
@@ -1083,6 +977,47 @@
       </w:r>
     </w:p>
     <w:p>
+      <w:pPr>
+        <w:rPr>
+          <w:b/>
+          <w:bCs/>
+        </w:rPr>
+      </w:pPr>
+      <w:r>
+        <w:rPr>
+          <w:b/>
+          <w:bCs/>
+        </w:rPr>
+        <w:lastRenderedPageBreak/>
+        <w:t xml:space="preserve">Descargamos </w:t>
+      </w:r>
+      <w:proofErr w:type="spellStart"/>
+      <w:r>
+        <w:rPr>
+          <w:b/>
+          <w:bCs/>
+        </w:rPr>
+        <w:t>httpd</w:t>
+      </w:r>
+      <w:proofErr w:type="spellEnd"/>
+      <w:r>
+        <w:rPr>
+          <w:b/>
+          <w:bCs/>
+        </w:rPr>
+        <w:t xml:space="preserve"> y </w:t>
+      </w:r>
+      <w:proofErr w:type="spellStart"/>
+      <w:r>
+        <w:rPr>
+          <w:b/>
+          <w:bCs/>
+        </w:rPr>
+        <w:t>ubuntu</w:t>
+      </w:r>
+      <w:proofErr w:type="spellEnd"/>
+    </w:p>
+    <w:p>
       <w:proofErr w:type="spellStart"/>
       <w:r>
         <w:t>docker</w:t>
@@ -1101,10 +1036,7 @@
       </w:r>
       <w:proofErr w:type="spellStart"/>
       <w:r>
-        <w:t>u</w:t>
-      </w:r>
-      <w:r>
-        <w:t>buntu</w:t>
+        <w:t>httpd</w:t>
       </w:r>
       <w:proofErr w:type="spellEnd"/>
     </w:p>
@@ -1114,10 +1046,10 @@
           <w:noProof/>
         </w:rPr>
         <w:drawing>
-          <wp:inline distT="0" distB="0" distL="0" distR="0" wp14:anchorId="3C772FF1" wp14:editId="39DCF87C">
-            <wp:extent cx="5400040" cy="948055"/>
-            <wp:effectExtent l="0" t="0" r="0" b="4445"/>
-            <wp:docPr id="29" name="Imagen 29"/>
+          <wp:inline distT="0" distB="0" distL="0" distR="0" wp14:anchorId="5F1B26B7" wp14:editId="7A685A40">
+            <wp:extent cx="5640865" cy="1933575"/>
+            <wp:effectExtent l="0" t="0" r="0" b="0"/>
+            <wp:docPr id="27" name="Imagen 27"/>
             <wp:cNvGraphicFramePr>
               <a:graphicFrameLocks xmlns:a="http://schemas.openxmlformats.org/drawingml/2006/main" noChangeAspect="1"/>
             </wp:cNvGraphicFramePr>
@@ -1137,7 +1069,7 @@
                   <pic:spPr>
                     <a:xfrm>
                       <a:off x="0" y="0"/>
-                      <a:ext cx="5400040" cy="948055"/>
+                      <a:ext cx="5657446" cy="1939259"/>
                     </a:xfrm>
                     <a:prstGeom prst="rect">
                       <a:avLst/>
@@ -1151,6 +1083,74 @@
       </w:r>
     </w:p>
     <w:p>
+      <w:proofErr w:type="spellStart"/>
+      <w:r>
+        <w:t>docker</w:t>
+      </w:r>
+      <w:proofErr w:type="spellEnd"/>
+      <w:r>
+        <w:t xml:space="preserve"> </w:t>
+      </w:r>
+      <w:proofErr w:type="spellStart"/>
+      <w:r>
+        <w:t>pull</w:t>
+      </w:r>
+      <w:proofErr w:type="spellEnd"/>
+      <w:r>
+        <w:t xml:space="preserve"> </w:t>
+      </w:r>
+      <w:proofErr w:type="spellStart"/>
+      <w:r>
+        <w:t>u</w:t>
+      </w:r>
+      <w:r>
+        <w:t>buntu</w:t>
+      </w:r>
+      <w:proofErr w:type="spellEnd"/>
+    </w:p>
+    <w:p>
+      <w:r>
+        <w:rPr>
+          <w:noProof/>
+        </w:rPr>
+        <w:drawing>
+          <wp:inline distT="0" distB="0" distL="0" distR="0" wp14:anchorId="3C772FF1" wp14:editId="107A5F0C">
+            <wp:extent cx="5696625" cy="1000125"/>
+            <wp:effectExtent l="0" t="0" r="0" b="0"/>
+            <wp:docPr id="29" name="Imagen 29"/>
+            <wp:cNvGraphicFramePr>
+              <a:graphicFrameLocks xmlns:a="http://schemas.openxmlformats.org/drawingml/2006/main" noChangeAspect="1"/>
+            </wp:cNvGraphicFramePr>
+            <a:graphic xmlns:a="http://schemas.openxmlformats.org/drawingml/2006/main">
+              <a:graphicData uri="http://schemas.openxmlformats.org/drawingml/2006/picture">
+                <pic:pic xmlns:pic="http://schemas.openxmlformats.org/drawingml/2006/picture">
+                  <pic:nvPicPr>
+                    <pic:cNvPr id="1" name=""/>
+                    <pic:cNvPicPr/>
+                  </pic:nvPicPr>
+                  <pic:blipFill>
+                    <a:blip r:embed="rId18"/>
+                    <a:stretch>
+                      <a:fillRect/>
+                    </a:stretch>
+                  </pic:blipFill>
+                  <pic:spPr>
+                    <a:xfrm>
+                      <a:off x="0" y="0"/>
+                      <a:ext cx="5728606" cy="1005740"/>
+                    </a:xfrm>
+                    <a:prstGeom prst="rect">
+                      <a:avLst/>
+                    </a:prstGeom>
+                  </pic:spPr>
+                </pic:pic>
+              </a:graphicData>
+            </a:graphic>
+          </wp:inline>
+        </w:drawing>
+      </w:r>
+    </w:p>
+    <w:p>
       <w:pPr>
         <w:rPr>
           <w:b/>
@@ -1180,21 +1180,938 @@
       </w:r>
       <w:proofErr w:type="spellEnd"/>
     </w:p>
+    <w:p>
+      <w:r>
+        <w:drawing>
+          <wp:inline distT="0" distB="0" distL="0" distR="0" wp14:anchorId="6B1835D8" wp14:editId="0A0A6B0F">
+            <wp:extent cx="5944528" cy="1095375"/>
+            <wp:effectExtent l="0" t="0" r="0" b="0"/>
+            <wp:docPr id="2" name="Imagen 2"/>
+            <wp:cNvGraphicFramePr>
+              <a:graphicFrameLocks xmlns:a="http://schemas.openxmlformats.org/drawingml/2006/main" noChangeAspect="1"/>
+            </wp:cNvGraphicFramePr>
+            <a:graphic xmlns:a="http://schemas.openxmlformats.org/drawingml/2006/main">
+              <a:graphicData uri="http://schemas.openxmlformats.org/drawingml/2006/picture">
+                <pic:pic xmlns:pic="http://schemas.openxmlformats.org/drawingml/2006/picture">
+                  <pic:nvPicPr>
+                    <pic:cNvPr id="1" name=""/>
+                    <pic:cNvPicPr/>
+                  </pic:nvPicPr>
+                  <pic:blipFill>
+                    <a:blip r:embed="rId19"/>
+                    <a:stretch>
+                      <a:fillRect/>
+                    </a:stretch>
+                  </pic:blipFill>
+                  <pic:spPr>
+                    <a:xfrm>
+                      <a:off x="0" y="0"/>
+                      <a:ext cx="5979049" cy="1101736"/>
+                    </a:xfrm>
+                    <a:prstGeom prst="rect">
+                      <a:avLst/>
+                    </a:prstGeom>
+                  </pic:spPr>
+                </pic:pic>
+              </a:graphicData>
+            </a:graphic>
+          </wp:inline>
+        </w:drawing>
+      </w:r>
+    </w:p>
+    <w:p>
+      <w:pPr>
+        <w:rPr>
+          <w:b/>
+          <w:bCs/>
+        </w:rPr>
+      </w:pPr>
+      <w:r>
+        <w:rPr>
+          <w:b/>
+          <w:bCs/>
+        </w:rPr>
+        <w:t>Ver los contenedores en ejecución</w:t>
+      </w:r>
+    </w:p>
+    <w:p>
+      <w:proofErr w:type="spellStart"/>
+      <w:r>
+        <w:t>docker</w:t>
+      </w:r>
+      <w:proofErr w:type="spellEnd"/>
+      <w:r>
+        <w:t xml:space="preserve"> </w:t>
+      </w:r>
+      <w:proofErr w:type="spellStart"/>
+      <w:r>
+        <w:t>ps</w:t>
+      </w:r>
+      <w:proofErr w:type="spellEnd"/>
+      <w:r>
+        <w:t xml:space="preserve"> -a</w:t>
+      </w:r>
+    </w:p>
+    <w:p>
+      <w:r>
+        <w:drawing>
+          <wp:inline distT="0" distB="0" distL="0" distR="0" wp14:anchorId="2B1B3708" wp14:editId="7719C017">
+            <wp:extent cx="6041625" cy="1076325"/>
+            <wp:effectExtent l="0" t="0" r="0" b="0"/>
+            <wp:docPr id="3" name="Imagen 3"/>
+            <wp:cNvGraphicFramePr>
+              <a:graphicFrameLocks xmlns:a="http://schemas.openxmlformats.org/drawingml/2006/main" noChangeAspect="1"/>
+            </wp:cNvGraphicFramePr>
+            <a:graphic xmlns:a="http://schemas.openxmlformats.org/drawingml/2006/main">
+              <a:graphicData uri="http://schemas.openxmlformats.org/drawingml/2006/picture">
+                <pic:pic xmlns:pic="http://schemas.openxmlformats.org/drawingml/2006/picture">
+                  <pic:nvPicPr>
+                    <pic:cNvPr id="1" name=""/>
+                    <pic:cNvPicPr/>
+                  </pic:nvPicPr>
+                  <pic:blipFill>
+                    <a:blip r:embed="rId20"/>
+                    <a:stretch>
+                      <a:fillRect/>
+                    </a:stretch>
+                  </pic:blipFill>
+                  <pic:spPr>
+                    <a:xfrm>
+                      <a:off x="0" y="0"/>
+                      <a:ext cx="6079758" cy="1083119"/>
+                    </a:xfrm>
+                    <a:prstGeom prst="rect">
+                      <a:avLst/>
+                    </a:prstGeom>
+                  </pic:spPr>
+                </pic:pic>
+              </a:graphicData>
+            </a:graphic>
+          </wp:inline>
+        </w:drawing>
+      </w:r>
+    </w:p>
+    <w:p>
+      <w:pPr>
+        <w:rPr>
+          <w:b/>
+          <w:bCs/>
+        </w:rPr>
+      </w:pPr>
+      <w:r>
+        <w:rPr>
+          <w:b/>
+          <w:bCs/>
+        </w:rPr>
+        <w:t>Si se ejecuta una imagen sin más, el contenedor puede arrancar y terminar sin más:</w:t>
+      </w:r>
+    </w:p>
+    <w:p>
+      <w:proofErr w:type="spellStart"/>
+      <w:r>
+        <w:t>docker</w:t>
+      </w:r>
+      <w:proofErr w:type="spellEnd"/>
+      <w:r>
+        <w:t xml:space="preserve"> run </w:t>
+      </w:r>
+      <w:r>
+        <w:t>Ubuntu</w:t>
+      </w:r>
+    </w:p>
+    <w:p>
+      <w:r>
+        <w:drawing>
+          <wp:inline distT="0" distB="0" distL="0" distR="0" wp14:anchorId="5D61EE4D" wp14:editId="56FEFC8C">
+            <wp:extent cx="5894922" cy="257175"/>
+            <wp:effectExtent l="0" t="0" r="0" b="0"/>
+            <wp:docPr id="5" name="Imagen 5"/>
+            <wp:cNvGraphicFramePr>
+              <a:graphicFrameLocks xmlns:a="http://schemas.openxmlformats.org/drawingml/2006/main" noChangeAspect="1"/>
+            </wp:cNvGraphicFramePr>
+            <a:graphic xmlns:a="http://schemas.openxmlformats.org/drawingml/2006/main">
+              <a:graphicData uri="http://schemas.openxmlformats.org/drawingml/2006/picture">
+                <pic:pic xmlns:pic="http://schemas.openxmlformats.org/drawingml/2006/picture">
+                  <pic:nvPicPr>
+                    <pic:cNvPr id="1" name=""/>
+                    <pic:cNvPicPr/>
+                  </pic:nvPicPr>
+                  <pic:blipFill>
+                    <a:blip r:embed="rId21"/>
+                    <a:stretch>
+                      <a:fillRect/>
+                    </a:stretch>
+                  </pic:blipFill>
+                  <pic:spPr>
+                    <a:xfrm>
+                      <a:off x="0" y="0"/>
+                      <a:ext cx="5988738" cy="261268"/>
+                    </a:xfrm>
+                    <a:prstGeom prst="rect">
+                      <a:avLst/>
+                    </a:prstGeom>
+                  </pic:spPr>
+                </pic:pic>
+              </a:graphicData>
+            </a:graphic>
+          </wp:inline>
+        </w:drawing>
+      </w:r>
+    </w:p>
+    <w:p>
+      <w:pPr>
+        <w:rPr>
+          <w:b/>
+          <w:bCs/>
+        </w:rPr>
+      </w:pPr>
+      <w:r>
+        <w:rPr>
+          <w:b/>
+          <w:bCs/>
+        </w:rPr>
+        <w:lastRenderedPageBreak/>
+        <w:t xml:space="preserve">Para hacer un comando con </w:t>
+      </w:r>
+      <w:proofErr w:type="spellStart"/>
+      <w:r>
+        <w:rPr>
+          <w:b/>
+          <w:bCs/>
+        </w:rPr>
+        <w:t>ubuntu</w:t>
+      </w:r>
+      <w:proofErr w:type="spellEnd"/>
+    </w:p>
+    <w:p>
+      <w:proofErr w:type="spellStart"/>
+      <w:r>
+        <w:t>docker</w:t>
+      </w:r>
+      <w:proofErr w:type="spellEnd"/>
+      <w:r>
+        <w:t xml:space="preserve"> run </w:t>
+      </w:r>
+      <w:proofErr w:type="spellStart"/>
+      <w:r>
+        <w:t>ubuntu</w:t>
+      </w:r>
+      <w:proofErr w:type="spellEnd"/>
+      <w:r>
+        <w:t xml:space="preserve"> </w:t>
+      </w:r>
+      <w:proofErr w:type="spellStart"/>
+      <w:r>
+        <w:t>ls</w:t>
+      </w:r>
+      <w:proofErr w:type="spellEnd"/>
+    </w:p>
+    <w:p>
+      <w:r>
+        <w:drawing>
+          <wp:inline distT="0" distB="0" distL="0" distR="0" wp14:anchorId="0830E5A1" wp14:editId="55D000AF">
+            <wp:extent cx="4314190" cy="2945967"/>
+            <wp:effectExtent l="0" t="0" r="0" b="6985"/>
+            <wp:docPr id="6" name="Imagen 6"/>
+            <wp:cNvGraphicFramePr>
+              <a:graphicFrameLocks xmlns:a="http://schemas.openxmlformats.org/drawingml/2006/main" noChangeAspect="1"/>
+            </wp:cNvGraphicFramePr>
+            <a:graphic xmlns:a="http://schemas.openxmlformats.org/drawingml/2006/main">
+              <a:graphicData uri="http://schemas.openxmlformats.org/drawingml/2006/picture">
+                <pic:pic xmlns:pic="http://schemas.openxmlformats.org/drawingml/2006/picture">
+                  <pic:nvPicPr>
+                    <pic:cNvPr id="1" name=""/>
+                    <pic:cNvPicPr/>
+                  </pic:nvPicPr>
+                  <pic:blipFill>
+                    <a:blip r:embed="rId22"/>
+                    <a:stretch>
+                      <a:fillRect/>
+                    </a:stretch>
+                  </pic:blipFill>
+                  <pic:spPr>
+                    <a:xfrm>
+                      <a:off x="0" y="0"/>
+                      <a:ext cx="4320792" cy="2950475"/>
+                    </a:xfrm>
+                    <a:prstGeom prst="rect">
+                      <a:avLst/>
+                    </a:prstGeom>
+                  </pic:spPr>
+                </pic:pic>
+              </a:graphicData>
+            </a:graphic>
+          </wp:inline>
+        </w:drawing>
+      </w:r>
+    </w:p>
+    <w:p>
+      <w:r>
+        <w:t>Lo hace y termina.</w:t>
+      </w:r>
+    </w:p>
+    <w:p>
+      <w:pPr>
+        <w:rPr>
+          <w:b/>
+          <w:bCs/>
+        </w:rPr>
+      </w:pPr>
+      <w:r>
+        <w:rPr>
+          <w:b/>
+          <w:bCs/>
+        </w:rPr>
+        <w:t>Para interactuar con un contenedor, se usan las opciones -</w:t>
+      </w:r>
+      <w:proofErr w:type="spellStart"/>
+      <w:r>
+        <w:rPr>
+          <w:b/>
+          <w:bCs/>
+        </w:rPr>
+        <w:t>it</w:t>
+      </w:r>
+      <w:proofErr w:type="spellEnd"/>
+    </w:p>
+    <w:p>
+      <w:proofErr w:type="spellStart"/>
+      <w:r>
+        <w:t>docker</w:t>
+      </w:r>
+      <w:proofErr w:type="spellEnd"/>
+      <w:r>
+        <w:t xml:space="preserve"> run -</w:t>
+      </w:r>
+      <w:proofErr w:type="spellStart"/>
+      <w:r>
+        <w:t>it</w:t>
+      </w:r>
+      <w:proofErr w:type="spellEnd"/>
+      <w:r>
+        <w:t xml:space="preserve"> </w:t>
+      </w:r>
+      <w:proofErr w:type="spellStart"/>
+      <w:r>
+        <w:t>ubuntu</w:t>
+      </w:r>
+      <w:proofErr w:type="spellEnd"/>
+      <w:r>
+        <w:t xml:space="preserve"> </w:t>
+      </w:r>
+      <w:proofErr w:type="spellStart"/>
+      <w:r>
+        <w:t>bash</w:t>
+      </w:r>
+      <w:proofErr w:type="spellEnd"/>
+    </w:p>
+    <w:p>
+      <w:r>
+        <w:drawing>
+          <wp:inline distT="0" distB="0" distL="0" distR="0" wp14:anchorId="352977F3" wp14:editId="265F0BB9">
+            <wp:extent cx="5400040" cy="381635"/>
+            <wp:effectExtent l="0" t="0" r="0" b="0"/>
+            <wp:docPr id="7" name="Imagen 7"/>
+            <wp:cNvGraphicFramePr>
+              <a:graphicFrameLocks xmlns:a="http://schemas.openxmlformats.org/drawingml/2006/main" noChangeAspect="1"/>
+            </wp:cNvGraphicFramePr>
+            <a:graphic xmlns:a="http://schemas.openxmlformats.org/drawingml/2006/main">
+              <a:graphicData uri="http://schemas.openxmlformats.org/drawingml/2006/picture">
+                <pic:pic xmlns:pic="http://schemas.openxmlformats.org/drawingml/2006/picture">
+                  <pic:nvPicPr>
+                    <pic:cNvPr id="1" name=""/>
+                    <pic:cNvPicPr/>
+                  </pic:nvPicPr>
+                  <pic:blipFill>
+                    <a:blip r:embed="rId23"/>
+                    <a:stretch>
+                      <a:fillRect/>
+                    </a:stretch>
+                  </pic:blipFill>
+                  <pic:spPr>
+                    <a:xfrm>
+                      <a:off x="0" y="0"/>
+                      <a:ext cx="5400040" cy="381635"/>
+                    </a:xfrm>
+                    <a:prstGeom prst="rect">
+                      <a:avLst/>
+                    </a:prstGeom>
+                  </pic:spPr>
+                </pic:pic>
+              </a:graphicData>
+            </a:graphic>
+          </wp:inline>
+        </w:drawing>
+      </w:r>
+    </w:p>
+    <w:p>
+      <w:pPr>
+        <w:rPr>
+          <w:b/>
+          <w:bCs/>
+        </w:rPr>
+      </w:pPr>
+      <w:r>
+        <w:rPr>
+          <w:b/>
+          <w:bCs/>
+        </w:rPr>
+        <w:t>Aparecerá el identificador del contenedor:</w:t>
+      </w:r>
+    </w:p>
+    <w:p>
+      <w:pPr>
+        <w:rPr>
+          <w:b/>
+          <w:bCs/>
+        </w:rPr>
+      </w:pPr>
+    </w:p>
+    <w:p>
+      <w:pPr>
+        <w:rPr>
+          <w:b/>
+          <w:bCs/>
+        </w:rPr>
+      </w:pPr>
+      <w:r>
+        <w:rPr>
+          <w:b/>
+          <w:bCs/>
+        </w:rPr>
+        <w:t>Con otra terminal podemos hacer</w:t>
+      </w:r>
+    </w:p>
+    <w:p>
+      <w:proofErr w:type="spellStart"/>
+      <w:r>
+        <w:t>docker</w:t>
+      </w:r>
+      <w:proofErr w:type="spellEnd"/>
+      <w:r>
+        <w:t xml:space="preserve"> </w:t>
+      </w:r>
+      <w:proofErr w:type="spellStart"/>
+      <w:r>
+        <w:t>ps</w:t>
+      </w:r>
+      <w:proofErr w:type="spellEnd"/>
+      <w:r>
+        <w:t xml:space="preserve"> -a y ver los estados de los contenedores que se han ejecutado hasta el momento:</w:t>
+      </w:r>
+    </w:p>
+    <w:p>
+      <w:r>
+        <w:drawing>
+          <wp:inline distT="0" distB="0" distL="0" distR="0" wp14:anchorId="44EF9FD1" wp14:editId="171DDC16">
+            <wp:extent cx="5400040" cy="2024380"/>
+            <wp:effectExtent l="0" t="0" r="0" b="0"/>
+            <wp:docPr id="8" name="Imagen 8"/>
+            <wp:cNvGraphicFramePr>
+              <a:graphicFrameLocks xmlns:a="http://schemas.openxmlformats.org/drawingml/2006/main" noChangeAspect="1"/>
+            </wp:cNvGraphicFramePr>
+            <a:graphic xmlns:a="http://schemas.openxmlformats.org/drawingml/2006/main">
+              <a:graphicData uri="http://schemas.openxmlformats.org/drawingml/2006/picture">
+                <pic:pic xmlns:pic="http://schemas.openxmlformats.org/drawingml/2006/picture">
+                  <pic:nvPicPr>
+                    <pic:cNvPr id="1" name=""/>
+                    <pic:cNvPicPr/>
+                  </pic:nvPicPr>
+                  <pic:blipFill>
+                    <a:blip r:embed="rId24"/>
+                    <a:stretch>
+                      <a:fillRect/>
+                    </a:stretch>
+                  </pic:blipFill>
+                  <pic:spPr>
+                    <a:xfrm>
+                      <a:off x="0" y="0"/>
+                      <a:ext cx="5400040" cy="2024380"/>
+                    </a:xfrm>
+                    <a:prstGeom prst="rect">
+                      <a:avLst/>
+                    </a:prstGeom>
+                  </pic:spPr>
+                </pic:pic>
+              </a:graphicData>
+            </a:graphic>
+          </wp:inline>
+        </w:drawing>
+      </w:r>
+    </w:p>
+    <w:p>
+      <w:pPr>
+        <w:rPr>
+          <w:b/>
+          <w:bCs/>
+        </w:rPr>
+      </w:pPr>
+      <w:r>
+        <w:rPr>
+          <w:b/>
+          <w:bCs/>
+        </w:rPr>
+        <w:lastRenderedPageBreak/>
+        <w:t xml:space="preserve">Si se ejecuta un comando dentro del contenedor, como </w:t>
+      </w:r>
+      <w:proofErr w:type="spellStart"/>
+      <w:r>
+        <w:rPr>
+          <w:b/>
+          <w:bCs/>
+        </w:rPr>
+        <w:t>mkdir</w:t>
+      </w:r>
+      <w:proofErr w:type="spellEnd"/>
+      <w:r>
+        <w:rPr>
+          <w:b/>
+          <w:bCs/>
+        </w:rPr>
+        <w:t xml:space="preserve"> pruebas, lo hace, pero cuando termine el contenedor no recordará nada (no es persistente)</w:t>
+      </w:r>
+    </w:p>
+    <w:p>
+      <w:r>
+        <w:rPr>
+          <w:noProof/>
+        </w:rPr>
+        <w:drawing>
+          <wp:inline distT="0" distB="0" distL="0" distR="0" wp14:anchorId="23212958" wp14:editId="50731F70">
+            <wp:extent cx="5400040" cy="1385570"/>
+            <wp:effectExtent l="0" t="0" r="0" b="5080"/>
+            <wp:docPr id="9" name="Imagen 9"/>
+            <wp:cNvGraphicFramePr>
+              <a:graphicFrameLocks xmlns:a="http://schemas.openxmlformats.org/drawingml/2006/main" noChangeAspect="1"/>
+            </wp:cNvGraphicFramePr>
+            <a:graphic xmlns:a="http://schemas.openxmlformats.org/drawingml/2006/main">
+              <a:graphicData uri="http://schemas.openxmlformats.org/drawingml/2006/picture">
+                <pic:pic xmlns:pic="http://schemas.openxmlformats.org/drawingml/2006/picture">
+                  <pic:nvPicPr>
+                    <pic:cNvPr id="1" name=""/>
+                    <pic:cNvPicPr/>
+                  </pic:nvPicPr>
+                  <pic:blipFill>
+                    <a:blip r:embed="rId25"/>
+                    <a:stretch>
+                      <a:fillRect/>
+                    </a:stretch>
+                  </pic:blipFill>
+                  <pic:spPr>
+                    <a:xfrm>
+                      <a:off x="0" y="0"/>
+                      <a:ext cx="5400040" cy="1385570"/>
+                    </a:xfrm>
+                    <a:prstGeom prst="rect">
+                      <a:avLst/>
+                    </a:prstGeom>
+                  </pic:spPr>
+                </pic:pic>
+              </a:graphicData>
+            </a:graphic>
+          </wp:inline>
+        </w:drawing>
+      </w:r>
+    </w:p>
+    <w:p>
+      <w:pPr>
+        <w:rPr>
+          <w:b/>
+          <w:bCs/>
+        </w:rPr>
+      </w:pPr>
+      <w:r>
+        <w:rPr>
+          <w:b/>
+          <w:bCs/>
+        </w:rPr>
+        <w:t>Salida de un contenedor:</w:t>
+      </w:r>
+    </w:p>
+    <w:p>
+      <w:proofErr w:type="spellStart"/>
+      <w:r>
+        <w:t>E</w:t>
+      </w:r>
+      <w:r>
+        <w:t>xit</w:t>
+      </w:r>
+      <w:proofErr w:type="spellEnd"/>
+    </w:p>
+    <w:p>
+      <w:r>
+        <w:rPr>
+          <w:noProof/>
+        </w:rPr>
+        <w:drawing>
+          <wp:inline distT="0" distB="0" distL="0" distR="0" wp14:anchorId="2BF80217" wp14:editId="48C605FF">
+            <wp:extent cx="5400040" cy="1385570"/>
+            <wp:effectExtent l="0" t="0" r="0" b="5080"/>
+            <wp:docPr id="10" name="Imagen 10"/>
+            <wp:cNvGraphicFramePr>
+              <a:graphicFrameLocks xmlns:a="http://schemas.openxmlformats.org/drawingml/2006/main" noChangeAspect="1"/>
+            </wp:cNvGraphicFramePr>
+            <a:graphic xmlns:a="http://schemas.openxmlformats.org/drawingml/2006/main">
+              <a:graphicData uri="http://schemas.openxmlformats.org/drawingml/2006/picture">
+                <pic:pic xmlns:pic="http://schemas.openxmlformats.org/drawingml/2006/picture">
+                  <pic:nvPicPr>
+                    <pic:cNvPr id="1" name=""/>
+                    <pic:cNvPicPr/>
+                  </pic:nvPicPr>
+                  <pic:blipFill>
+                    <a:blip r:embed="rId25"/>
+                    <a:stretch>
+                      <a:fillRect/>
+                    </a:stretch>
+                  </pic:blipFill>
+                  <pic:spPr>
+                    <a:xfrm>
+                      <a:off x="0" y="0"/>
+                      <a:ext cx="5400040" cy="1385570"/>
+                    </a:xfrm>
+                    <a:prstGeom prst="rect">
+                      <a:avLst/>
+                    </a:prstGeom>
+                  </pic:spPr>
+                </pic:pic>
+              </a:graphicData>
+            </a:graphic>
+          </wp:inline>
+        </w:drawing>
+      </w:r>
+    </w:p>
+    <w:p>
+      <w:pPr>
+        <w:rPr>
+          <w:b/>
+          <w:bCs/>
+        </w:rPr>
+      </w:pPr>
+      <w:r>
+        <w:rPr>
+          <w:b/>
+          <w:bCs/>
+        </w:rPr>
+        <w:t xml:space="preserve">Borrado de un contenedor de la lista que sale con </w:t>
+      </w:r>
+      <w:proofErr w:type="spellStart"/>
+      <w:r>
+        <w:rPr>
+          <w:b/>
+          <w:bCs/>
+        </w:rPr>
+        <w:t>docker</w:t>
+      </w:r>
+      <w:proofErr w:type="spellEnd"/>
+      <w:r>
+        <w:rPr>
+          <w:b/>
+          <w:bCs/>
+        </w:rPr>
+        <w:t xml:space="preserve"> </w:t>
+      </w:r>
+      <w:proofErr w:type="spellStart"/>
+      <w:r>
+        <w:rPr>
+          <w:b/>
+          <w:bCs/>
+        </w:rPr>
+        <w:t>ps</w:t>
+      </w:r>
+      <w:proofErr w:type="spellEnd"/>
+      <w:r>
+        <w:rPr>
+          <w:b/>
+          <w:bCs/>
+        </w:rPr>
+        <w:t xml:space="preserve"> -a</w:t>
+      </w:r>
+    </w:p>
+    <w:p>
+      <w:proofErr w:type="spellStart"/>
+      <w:r>
+        <w:t>docker</w:t>
+      </w:r>
+      <w:proofErr w:type="spellEnd"/>
+      <w:r>
+        <w:t xml:space="preserve"> </w:t>
+      </w:r>
+      <w:proofErr w:type="spellStart"/>
+      <w:r>
+        <w:t>rm</w:t>
+      </w:r>
+      <w:proofErr w:type="spellEnd"/>
+      <w:r>
+        <w:t xml:space="preserve"> </w:t>
+      </w:r>
+      <w:proofErr w:type="spellStart"/>
+      <w:r>
+        <w:t>id_contenedor</w:t>
+      </w:r>
+      <w:proofErr w:type="spellEnd"/>
+      <w:r>
+        <w:t xml:space="preserve"> Ej: </w:t>
+      </w:r>
+      <w:proofErr w:type="spellStart"/>
+      <w:r>
+        <w:t>docker</w:t>
+      </w:r>
+      <w:proofErr w:type="spellEnd"/>
+      <w:r>
+        <w:t xml:space="preserve"> </w:t>
+      </w:r>
+      <w:proofErr w:type="spellStart"/>
+      <w:r>
+        <w:t>rm</w:t>
+      </w:r>
+      <w:proofErr w:type="spellEnd"/>
+      <w:r>
+        <w:t xml:space="preserve"> a5</w:t>
+      </w:r>
+    </w:p>
+    <w:p>
+      <w:r>
+        <w:rPr>
+          <w:noProof/>
+        </w:rPr>
+        <w:drawing>
+          <wp:inline distT="0" distB="0" distL="0" distR="0" wp14:anchorId="09C56910" wp14:editId="6188AD53">
+            <wp:extent cx="4406063" cy="4019550"/>
+            <wp:effectExtent l="0" t="0" r="0" b="0"/>
+            <wp:docPr id="11" name="Imagen 11"/>
+            <wp:cNvGraphicFramePr>
+              <a:graphicFrameLocks xmlns:a="http://schemas.openxmlformats.org/drawingml/2006/main" noChangeAspect="1"/>
+            </wp:cNvGraphicFramePr>
+            <a:graphic xmlns:a="http://schemas.openxmlformats.org/drawingml/2006/main">
+              <a:graphicData uri="http://schemas.openxmlformats.org/drawingml/2006/picture">
+                <pic:pic xmlns:pic="http://schemas.openxmlformats.org/drawingml/2006/picture">
+                  <pic:nvPicPr>
+                    <pic:cNvPr id="1" name=""/>
+                    <pic:cNvPicPr/>
+                  </pic:nvPicPr>
+                  <pic:blipFill>
+                    <a:blip r:embed="rId26"/>
+                    <a:stretch>
+                      <a:fillRect/>
+                    </a:stretch>
+                  </pic:blipFill>
+                  <pic:spPr>
+                    <a:xfrm>
+                      <a:off x="0" y="0"/>
+                      <a:ext cx="4413828" cy="4026634"/>
+                    </a:xfrm>
+                    <a:prstGeom prst="rect">
+                      <a:avLst/>
+                    </a:prstGeom>
+                  </pic:spPr>
+                </pic:pic>
+              </a:graphicData>
+            </a:graphic>
+          </wp:inline>
+        </w:drawing>
+      </w:r>
+    </w:p>
+    <w:p>
+      <w:pPr>
+        <w:rPr>
+          <w:b/>
+          <w:bCs/>
+        </w:rPr>
+      </w:pPr>
+      <w:r>
+        <w:rPr>
+          <w:b/>
+          <w:bCs/>
+        </w:rPr>
+        <w:lastRenderedPageBreak/>
+        <w:t xml:space="preserve">En vez de 2 terminales se puede usar una con </w:t>
+      </w:r>
+      <w:proofErr w:type="spellStart"/>
+      <w:r>
+        <w:rPr>
+          <w:b/>
+          <w:bCs/>
+        </w:rPr>
+        <w:t>docker</w:t>
+      </w:r>
+      <w:proofErr w:type="spellEnd"/>
+      <w:r>
+        <w:rPr>
+          <w:b/>
+          <w:bCs/>
+        </w:rPr>
+        <w:t xml:space="preserve"> y con un contenedor en ejecución, pulsar </w:t>
+      </w:r>
+      <w:proofErr w:type="spellStart"/>
+      <w:r>
+        <w:rPr>
+          <w:b/>
+          <w:bCs/>
+        </w:rPr>
+        <w:t>Control+q+p</w:t>
+      </w:r>
+      <w:proofErr w:type="spellEnd"/>
+      <w:r>
+        <w:rPr>
+          <w:b/>
+          <w:bCs/>
+        </w:rPr>
+        <w:t xml:space="preserve"> para ir del contenedor a terminal sin más. Para volver al contenedor, se pone</w:t>
+      </w:r>
+    </w:p>
+    <w:p>
+      <w:proofErr w:type="spellStart"/>
+      <w:r>
+        <w:t>docker</w:t>
+      </w:r>
+      <w:proofErr w:type="spellEnd"/>
+      <w:r>
+        <w:t xml:space="preserve"> </w:t>
+      </w:r>
+      <w:proofErr w:type="spellStart"/>
+      <w:r>
+        <w:t>attach</w:t>
+      </w:r>
+      <w:proofErr w:type="spellEnd"/>
+      <w:r>
+        <w:t xml:space="preserve"> id</w:t>
+      </w:r>
+    </w:p>
+    <w:p>
+      <w:r>
+        <w:rPr>
+          <w:noProof/>
+        </w:rPr>
+        <w:drawing>
+          <wp:inline distT="0" distB="0" distL="0" distR="0" wp14:anchorId="5DA4FFFA" wp14:editId="5EB166C5">
+            <wp:extent cx="5658975" cy="5162550"/>
+            <wp:effectExtent l="0" t="0" r="0" b="0"/>
+            <wp:docPr id="13" name="Imagen 13"/>
+            <wp:cNvGraphicFramePr>
+              <a:graphicFrameLocks xmlns:a="http://schemas.openxmlformats.org/drawingml/2006/main" noChangeAspect="1"/>
+            </wp:cNvGraphicFramePr>
+            <a:graphic xmlns:a="http://schemas.openxmlformats.org/drawingml/2006/main">
+              <a:graphicData uri="http://schemas.openxmlformats.org/drawingml/2006/picture">
+                <pic:pic xmlns:pic="http://schemas.openxmlformats.org/drawingml/2006/picture">
+                  <pic:nvPicPr>
+                    <pic:cNvPr id="1" name=""/>
+                    <pic:cNvPicPr/>
+                  </pic:nvPicPr>
+                  <pic:blipFill>
+                    <a:blip r:embed="rId26"/>
+                    <a:stretch>
+                      <a:fillRect/>
+                    </a:stretch>
+                  </pic:blipFill>
+                  <pic:spPr>
+                    <a:xfrm>
+                      <a:off x="0" y="0"/>
+                      <a:ext cx="5660785" cy="5164201"/>
+                    </a:xfrm>
+                    <a:prstGeom prst="rect">
+                      <a:avLst/>
+                    </a:prstGeom>
+                  </pic:spPr>
+                </pic:pic>
+              </a:graphicData>
+            </a:graphic>
+          </wp:inline>
+        </w:drawing>
+      </w:r>
+      <w:r>
+        <w:t xml:space="preserve"> </w:t>
+      </w:r>
+    </w:p>
+    <w:p>
+      <w:r>
+        <w:t>Observa que basta, en la mayoría de los casos, usar los 2 primeros dígitos del contenedor para referirse a él.</w:t>
+      </w:r>
+    </w:p>
+    <w:p>
+      <w:r>
+        <w:t xml:space="preserve">Con los comandos stop, </w:t>
+      </w:r>
+      <w:proofErr w:type="spellStart"/>
+      <w:r>
+        <w:t>start</w:t>
+      </w:r>
+      <w:proofErr w:type="spellEnd"/>
+      <w:r>
+        <w:t xml:space="preserve"> y </w:t>
+      </w:r>
+      <w:proofErr w:type="spellStart"/>
+      <w:r>
+        <w:t>attach</w:t>
+      </w:r>
+      <w:proofErr w:type="spellEnd"/>
+      <w:r>
+        <w:t xml:space="preserve"> es posible parar el contenedor, iniciarlo y volver a él.</w:t>
+      </w:r>
+      <w:r>
+        <w:t xml:space="preserve"> </w:t>
+      </w:r>
+    </w:p>
     <w:p/>
     <w:p>
       <w:pPr>
         <w:rPr>
-          <w:b/>
-          <w:bCs/>
-        </w:rPr>
-      </w:pPr>
-      <w:r>
-        <w:rPr>
-          <w:b/>
-          <w:bCs/>
-        </w:rPr>
-        <w:t>Ver los contenedores en ejecución</w:t>
-      </w:r>
+          <w:rFonts w:asciiTheme="majorHAnsi" w:eastAsiaTheme="majorEastAsia" w:hAnsiTheme="majorHAnsi" w:cstheme="majorBidi"/>
+          <w:b/>
+          <w:sz w:val="32"/>
+          <w:szCs w:val="32"/>
+        </w:rPr>
+      </w:pPr>
+      <w:r>
+        <w:br w:type="page"/>
+      </w:r>
+    </w:p>
+    <w:p>
+      <w:pPr>
+        <w:pStyle w:val="Ttulo1"/>
+      </w:pPr>
+      <w:r>
+        <w:lastRenderedPageBreak/>
+        <w:t>Personalización de contenedores</w:t>
+      </w:r>
+    </w:p>
+    <w:p>
+      <w:r>
+        <w:t xml:space="preserve">Hasta que no se crea una imagen de un contenedor, con </w:t>
+      </w:r>
+      <w:proofErr w:type="spellStart"/>
+      <w:r>
+        <w:t>commit</w:t>
+      </w:r>
+      <w:proofErr w:type="spellEnd"/>
+      <w:r>
+        <w:t>, no se conserva (persiste) lo hecho en el contenedor.</w:t>
+      </w:r>
+    </w:p>
+    <w:p>
+      <w:r>
+        <w:t xml:space="preserve">- Se ejecuta el contenedor y se da a </w:t>
+      </w:r>
+      <w:proofErr w:type="spellStart"/>
+      <w:r>
+        <w:t>apt</w:t>
+      </w:r>
+      <w:proofErr w:type="spellEnd"/>
+      <w:r>
+        <w:t xml:space="preserve"> </w:t>
+      </w:r>
+      <w:proofErr w:type="spellStart"/>
+      <w:r>
+        <w:t>get</w:t>
+      </w:r>
+      <w:proofErr w:type="spellEnd"/>
+      <w:r>
+        <w:t xml:space="preserve"> </w:t>
+      </w:r>
+      <w:proofErr w:type="spellStart"/>
+      <w:r>
+        <w:t>update</w:t>
+      </w:r>
+      <w:proofErr w:type="spellEnd"/>
     </w:p>
     <w:p>
       <w:proofErr w:type="spellStart"/>
@@ -1203,71 +2120,353 @@
       </w:r>
       <w:proofErr w:type="spellEnd"/>
       <w:r>
-        <w:t xml:space="preserve"> </w:t>
-      </w:r>
-      <w:proofErr w:type="spellStart"/>
-      <w:r>
-        <w:t>ps</w:t>
-      </w:r>
-      <w:proofErr w:type="spellEnd"/>
-      <w:r>
-        <w:t xml:space="preserve"> -a</w:t>
+        <w:t xml:space="preserve"> run -</w:t>
+      </w:r>
+      <w:proofErr w:type="spellStart"/>
+      <w:r>
+        <w:t>it</w:t>
+      </w:r>
+      <w:proofErr w:type="spellEnd"/>
+      <w:r>
+        <w:t xml:space="preserve"> </w:t>
+      </w:r>
+      <w:proofErr w:type="spellStart"/>
+      <w:r>
+        <w:t>ubuntu</w:t>
+      </w:r>
+      <w:proofErr w:type="spellEnd"/>
+      <w:r>
+        <w:t xml:space="preserve"> </w:t>
+      </w:r>
+      <w:proofErr w:type="spellStart"/>
+      <w:r>
+        <w:t>bash</w:t>
+      </w:r>
+      <w:proofErr w:type="spellEnd"/>
+    </w:p>
+    <w:p>
+      <w:proofErr w:type="spellStart"/>
+      <w:r>
+        <w:t>apt</w:t>
+      </w:r>
+      <w:proofErr w:type="spellEnd"/>
+      <w:r>
+        <w:t xml:space="preserve"> </w:t>
+      </w:r>
+      <w:proofErr w:type="spellStart"/>
+      <w:r>
+        <w:t>update</w:t>
+      </w:r>
+      <w:proofErr w:type="spellEnd"/>
+    </w:p>
+    <w:p>
+      <w:proofErr w:type="spellStart"/>
+      <w:r>
+        <w:t>mkdir</w:t>
+      </w:r>
+      <w:proofErr w:type="spellEnd"/>
+      <w:r>
+        <w:t xml:space="preserve"> prueba</w:t>
+      </w:r>
+    </w:p>
+    <w:p>
+      <w:proofErr w:type="spellStart"/>
+      <w:r>
+        <w:t>mkdir</w:t>
+      </w:r>
+      <w:proofErr w:type="spellEnd"/>
+      <w:r>
+        <w:t xml:space="preserve"> 2daw</w:t>
+      </w:r>
+    </w:p>
+    <w:p>
+      <w:r>
+        <w:rPr>
+          <w:noProof/>
+        </w:rPr>
+        <w:drawing>
+          <wp:inline distT="0" distB="0" distL="0" distR="0" wp14:anchorId="03AFA225" wp14:editId="1CA665AB">
+            <wp:extent cx="5400040" cy="1071880"/>
+            <wp:effectExtent l="0" t="0" r="0" b="0"/>
+            <wp:docPr id="14" name="Imagen 14"/>
+            <wp:cNvGraphicFramePr>
+              <a:graphicFrameLocks xmlns:a="http://schemas.openxmlformats.org/drawingml/2006/main" noChangeAspect="1"/>
+            </wp:cNvGraphicFramePr>
+            <a:graphic xmlns:a="http://schemas.openxmlformats.org/drawingml/2006/main">
+              <a:graphicData uri="http://schemas.openxmlformats.org/drawingml/2006/picture">
+                <pic:pic xmlns:pic="http://schemas.openxmlformats.org/drawingml/2006/picture">
+                  <pic:nvPicPr>
+                    <pic:cNvPr id="1" name=""/>
+                    <pic:cNvPicPr/>
+                  </pic:nvPicPr>
+                  <pic:blipFill>
+                    <a:blip r:embed="rId27"/>
+                    <a:stretch>
+                      <a:fillRect/>
+                    </a:stretch>
+                  </pic:blipFill>
+                  <pic:spPr>
+                    <a:xfrm>
+                      <a:off x="0" y="0"/>
+                      <a:ext cx="5400040" cy="1071880"/>
+                    </a:xfrm>
+                    <a:prstGeom prst="rect">
+                      <a:avLst/>
+                    </a:prstGeom>
+                  </pic:spPr>
+                </pic:pic>
+              </a:graphicData>
+            </a:graphic>
+          </wp:inline>
+        </w:drawing>
+      </w:r>
+    </w:p>
+    <w:p>
+      <w:r>
+        <w:t xml:space="preserve">- En otra terminal o en esa terminal con </w:t>
+      </w:r>
+      <w:proofErr w:type="spellStart"/>
+      <w:r>
+        <w:t>Control+q+p</w:t>
+      </w:r>
+      <w:proofErr w:type="spellEnd"/>
+      <w:r>
+        <w:t xml:space="preserve"> hacemos:</w:t>
+      </w:r>
+    </w:p>
+    <w:p>
+      <w:proofErr w:type="spellStart"/>
+      <w:r>
+        <w:t>docker</w:t>
+      </w:r>
+      <w:proofErr w:type="spellEnd"/>
+      <w:r>
+        <w:t xml:space="preserve"> </w:t>
+      </w:r>
+      <w:proofErr w:type="spellStart"/>
+      <w:r>
+        <w:t>commit</w:t>
+      </w:r>
+      <w:proofErr w:type="spellEnd"/>
+      <w:r>
+        <w:t xml:space="preserve"> id nombre</w:t>
       </w:r>
     </w:p>
     <w:p/>
     <w:p>
-      <w:pPr>
-        <w:rPr>
-          <w:b/>
-          <w:bCs/>
-        </w:rPr>
-      </w:pPr>
-      <w:r>
-        <w:rPr>
-          <w:b/>
-          <w:bCs/>
-        </w:rPr>
-        <w:t>Si se ejecuta una imagen sin más, el contenedor puede arrancar y terminar sin más:</w:t>
-      </w:r>
-    </w:p>
-    <w:p>
-      <w:proofErr w:type="spellStart"/>
+      <w:r>
+        <w:t>En nuestro caso:</w:t>
+      </w:r>
+    </w:p>
+    <w:p>
+      <w:proofErr w:type="spellStart"/>
+      <w:r>
+        <w:t>docker</w:t>
+      </w:r>
+      <w:proofErr w:type="spellEnd"/>
+      <w:r>
+        <w:t xml:space="preserve"> </w:t>
+      </w:r>
+      <w:proofErr w:type="spellStart"/>
+      <w:r>
+        <w:t>commit</w:t>
+      </w:r>
+      <w:proofErr w:type="spellEnd"/>
+      <w:r>
+        <w:t xml:space="preserve"> 18 </w:t>
+      </w:r>
+      <w:proofErr w:type="spellStart"/>
+      <w:r>
+        <w:t>ubuntu</w:t>
+      </w:r>
+      <w:proofErr w:type="spellEnd"/>
+      <w:r>
+        <w:t>-prueba</w:t>
+      </w:r>
+    </w:p>
+    <w:p/>
+    <w:p>
+      <w:r>
+        <w:t xml:space="preserve">Con </w:t>
+      </w:r>
+      <w:proofErr w:type="spellStart"/>
+      <w:r>
+        <w:t>docker</w:t>
+      </w:r>
+      <w:proofErr w:type="spellEnd"/>
+      <w:r>
+        <w:t xml:space="preserve"> </w:t>
+      </w:r>
+      <w:proofErr w:type="spellStart"/>
+      <w:r>
+        <w:t>images</w:t>
+      </w:r>
+      <w:proofErr w:type="spellEnd"/>
+      <w:r>
+        <w:t xml:space="preserve"> se verá que se ha creado</w:t>
+      </w:r>
+    </w:p>
+    <w:p/>
+    <w:p>
+      <w:r>
+        <w:t>Con esta imagen creada, si la ejecutamos, comprobaremos que se han mantenido las carpetas creadas:</w:t>
+      </w:r>
+    </w:p>
+    <w:p>
+      <w:r>
+        <w:t>Supongamos que, a partir de este contenedor, se quiere instalar un servidor web Apache:</w:t>
+      </w:r>
+    </w:p>
+    <w:p>
+      <w:proofErr w:type="spellStart"/>
+      <w:r>
+        <w:t>apt</w:t>
+      </w:r>
+      <w:proofErr w:type="spellEnd"/>
+      <w:r>
+        <w:t xml:space="preserve"> </w:t>
+      </w:r>
+      <w:proofErr w:type="spellStart"/>
+      <w:r>
+        <w:t>update</w:t>
+      </w:r>
+      <w:proofErr w:type="spellEnd"/>
+    </w:p>
+    <w:p>
+      <w:proofErr w:type="spellStart"/>
+      <w:r>
+        <w:t>apt</w:t>
+      </w:r>
+      <w:proofErr w:type="spellEnd"/>
+      <w:r>
+        <w:t xml:space="preserve"> </w:t>
+      </w:r>
+      <w:proofErr w:type="spellStart"/>
+      <w:r>
+        <w:t>install</w:t>
+      </w:r>
+      <w:proofErr w:type="spellEnd"/>
+      <w:r>
+        <w:t xml:space="preserve"> apache2</w:t>
+      </w:r>
+    </w:p>
+    <w:p>
+      <w:proofErr w:type="spellStart"/>
+      <w:r>
+        <w:t>service</w:t>
+      </w:r>
+      <w:proofErr w:type="spellEnd"/>
+      <w:r>
+        <w:t xml:space="preserve"> apache2 </w:t>
+      </w:r>
+      <w:proofErr w:type="spellStart"/>
+      <w:r>
+        <w:t>start</w:t>
+      </w:r>
+      <w:proofErr w:type="spellEnd"/>
+    </w:p>
+    <w:p>
+      <w:proofErr w:type="spellStart"/>
+      <w:r>
+        <w:t>service</w:t>
+      </w:r>
+      <w:proofErr w:type="spellEnd"/>
+      <w:r>
+        <w:t xml:space="preserve"> apache2 status</w:t>
+      </w:r>
+    </w:p>
+    <w:p/>
+    <w:p>
       <w:r>
         <w:lastRenderedPageBreak/>
+        <w:t>Una vez instalado apache2, se va a crear una imagen, esta vez con una serie de parámetros.</w:t>
+      </w:r>
+    </w:p>
+    <w:p>
+      <w:proofErr w:type="spellStart"/>
+      <w:r>
         <w:t>docker</w:t>
       </w:r>
       <w:proofErr w:type="spellEnd"/>
       <w:r>
-        <w:t xml:space="preserve"> run </w:t>
-      </w:r>
-      <w:r>
-        <w:t>Ubuntu</w:t>
+        <w:t xml:space="preserve"> </w:t>
+      </w:r>
+      <w:proofErr w:type="spellStart"/>
+      <w:r>
+        <w:t>commit</w:t>
+      </w:r>
+      <w:proofErr w:type="spellEnd"/>
+      <w:r>
+        <w:t xml:space="preserve"> --</w:t>
+      </w:r>
+      <w:proofErr w:type="spellStart"/>
+      <w:r>
+        <w:t>change</w:t>
+      </w:r>
+      <w:proofErr w:type="spellEnd"/>
+      <w:r>
+        <w:t>='CMD ["</w:t>
+      </w:r>
+      <w:proofErr w:type="spellStart"/>
+      <w:r>
+        <w:t>apachectl</w:t>
+      </w:r>
+      <w:proofErr w:type="spellEnd"/>
+      <w:r>
+        <w:t>", "-DFOREGROUND"]' -c "EXPOSE 80" 79 apache2mio</w:t>
+      </w:r>
+    </w:p>
+    <w:p>
+      <w:r>
+        <w:t xml:space="preserve">Ojo: no formar el comando desde un procesador de textos no limpio como </w:t>
+      </w:r>
+      <w:proofErr w:type="spellStart"/>
+      <w:r>
+        <w:t>Writer</w:t>
+      </w:r>
+      <w:proofErr w:type="spellEnd"/>
+      <w:r>
+        <w:t>, que puede alterar el tipo de comillas y no funcionar correctamente</w:t>
       </w:r>
     </w:p>
     <w:p/>
     <w:p>
-      <w:pPr>
-        <w:rPr>
-          <w:b/>
-          <w:bCs/>
-        </w:rPr>
-      </w:pPr>
-      <w:r>
-        <w:rPr>
-          <w:b/>
-          <w:bCs/>
-        </w:rPr>
-        <w:t xml:space="preserve">Para hacer un comando con </w:t>
-      </w:r>
-      <w:proofErr w:type="spellStart"/>
-      <w:r>
-        <w:rPr>
-          <w:b/>
-          <w:bCs/>
-        </w:rPr>
-        <w:t>ubuntu</w:t>
-      </w:r>
-      <w:proofErr w:type="spellEnd"/>
+      <w:r>
+        <w:t>Se ha creado una imagen, llamada apache2mio</w:t>
+      </w:r>
+    </w:p>
+    <w:p>
+      <w:r>
+        <w:t xml:space="preserve">A </w:t>
+      </w:r>
+      <w:proofErr w:type="gramStart"/>
+      <w:r>
+        <w:t>continuación</w:t>
+      </w:r>
+      <w:proofErr w:type="gramEnd"/>
+      <w:r>
+        <w:t xml:space="preserve"> vamos a ejecutar la imagen recién creada, iniciando un contenedor con parámetros -d (demonio, para ejecutar en segundo plano) y -p, para asociar el puerto 5000 de nuestro ordenador anfitrión Ubuntu con el puerto 80 del contenedor, donde estará escuchando apache2.</w:t>
+      </w:r>
+    </w:p>
+    <w:p/>
+    <w:p>
+      <w:r>
+        <w:t xml:space="preserve">Ahora, si en nuestro sistema operativo anfitrión entramos en el </w:t>
+      </w:r>
+      <w:proofErr w:type="spellStart"/>
+      <w:r>
+        <w:t>el</w:t>
+      </w:r>
+      <w:proofErr w:type="spellEnd"/>
+      <w:r>
+        <w:t xml:space="preserve"> navegador de internet y ponemos localhost:5000, debe aparecer la página web de inicio del servidor apache2 de nuestro contenedor apache2mio</w:t>
+      </w:r>
+    </w:p>
+    <w:p/>
+    <w:p>
+      <w:r>
+        <w:t>Con</w:t>
+      </w:r>
     </w:p>
     <w:p>
       <w:proofErr w:type="spellStart"/>
@@ -1276,37 +2475,107 @@
       </w:r>
       <w:proofErr w:type="spellEnd"/>
       <w:r>
-        <w:t xml:space="preserve"> run </w:t>
-      </w:r>
-      <w:proofErr w:type="spellStart"/>
-      <w:r>
-        <w:t>ubuntu</w:t>
-      </w:r>
-      <w:proofErr w:type="spellEnd"/>
-      <w:r>
-        <w:t xml:space="preserve"> </w:t>
-      </w:r>
-      <w:proofErr w:type="spellStart"/>
-      <w:r>
-        <w:t>ls</w:t>
-      </w:r>
-      <w:proofErr w:type="spellEnd"/>
+        <w:t xml:space="preserve"> stop </w:t>
+      </w:r>
+      <w:proofErr w:type="spellStart"/>
+      <w:r>
+        <w:t>id_contenedor</w:t>
+      </w:r>
+      <w:proofErr w:type="spellEnd"/>
+      <w:r>
+        <w:t xml:space="preserve"> se parará el contenedor. En mi caso es </w:t>
+      </w:r>
+      <w:proofErr w:type="spellStart"/>
+      <w:r>
+        <w:t>docker</w:t>
+      </w:r>
+      <w:proofErr w:type="spellEnd"/>
+      <w:r>
+        <w:t xml:space="preserve"> stop 07</w:t>
+      </w:r>
     </w:p>
     <w:p/>
     <w:p>
       <w:r>
-        <w:t>Lo hace y termina.</w:t>
-      </w:r>
-    </w:p>
-    <w:p>
-      <w:r>
-        <w:t>Para interactuar con un contenedor, se usan las opciones -</w:t>
-      </w:r>
-      <w:proofErr w:type="spellStart"/>
-      <w:r>
-        <w:t>it</w:t>
-      </w:r>
-      <w:proofErr w:type="spellEnd"/>
+        <w:br w:type="page"/>
+      </w:r>
+    </w:p>
+    <w:p>
+      <w:pPr>
+        <w:pStyle w:val="Ttulo1"/>
+        <w:jc w:val="center"/>
+      </w:pPr>
+      <w:proofErr w:type="spellStart"/>
+      <w:r>
+        <w:lastRenderedPageBreak/>
+        <w:t>DockerFile</w:t>
+      </w:r>
+      <w:proofErr w:type="spellEnd"/>
+    </w:p>
+    <w:p>
+      <w:proofErr w:type="spellStart"/>
+      <w:r>
+        <w:t>DockerFile</w:t>
+      </w:r>
+      <w:proofErr w:type="spellEnd"/>
+      <w:r>
+        <w:t xml:space="preserve"> sirve para realizar imágenes a partir de un contenedor personalizado de una manera sencilla.</w:t>
+      </w:r>
+    </w:p>
+    <w:p>
+      <w:r>
+        <w:t>Se trata de un documento de texto que contiene los comandos a ejecutar para crear una imagen personalizada.</w:t>
+      </w:r>
+    </w:p>
+    <w:p>
+      <w:r>
+        <w:t>Ejemplo 1:</w:t>
+      </w:r>
+    </w:p>
+    <w:p>
+      <w:r>
+        <w:t xml:space="preserve">- Se crea una carpeta llamada </w:t>
+      </w:r>
+      <w:proofErr w:type="spellStart"/>
+      <w:r>
+        <w:t>miweb</w:t>
+      </w:r>
+      <w:proofErr w:type="spellEnd"/>
+      <w:r>
+        <w:t xml:space="preserve"> dentro de nuestra carpeta personal en Ubuntu.</w:t>
+      </w:r>
+    </w:p>
+    <w:p>
+      <w:r>
+        <w:t xml:space="preserve">- Dentro de esa carpeta creamos con un editor de textos un archivo llamado </w:t>
+      </w:r>
+      <w:proofErr w:type="spellStart"/>
+      <w:r>
+        <w:t>Dockerfile</w:t>
+      </w:r>
+      <w:proofErr w:type="spellEnd"/>
+      <w:r>
+        <w:t xml:space="preserve"> (se tiene que llamar así) con esta información:</w:t>
+      </w:r>
+    </w:p>
+    <w:p/>
+    <w:p>
+      <w:r>
+        <w:t xml:space="preserve">- Se crea la imagen, llamada </w:t>
+      </w:r>
+      <w:proofErr w:type="spellStart"/>
+      <w:r>
+        <w:t>miweb</w:t>
+      </w:r>
+      <w:proofErr w:type="spellEnd"/>
+      <w:r>
+        <w:t xml:space="preserve">, con </w:t>
+      </w:r>
+      <w:proofErr w:type="gramStart"/>
+      <w:r>
+        <w:t>este comandos</w:t>
+      </w:r>
+      <w:proofErr w:type="gramEnd"/>
     </w:p>
     <w:p>
       <w:proofErr w:type="spellStart"/>
@@ -1315,89 +2584,575 @@
       </w:r>
       <w:proofErr w:type="spellEnd"/>
       <w:r>
-        <w:t xml:space="preserve"> run -</w:t>
-      </w:r>
-      <w:proofErr w:type="spellStart"/>
-      <w:r>
-        <w:t>it</w:t>
-      </w:r>
-      <w:proofErr w:type="spellEnd"/>
-      <w:r>
-        <w:t xml:space="preserve"> </w:t>
-      </w:r>
-      <w:proofErr w:type="spellStart"/>
-      <w:r>
-        <w:t>ubuntu</w:t>
-      </w:r>
-      <w:proofErr w:type="spellEnd"/>
-      <w:r>
-        <w:t xml:space="preserve"> </w:t>
-      </w:r>
-      <w:proofErr w:type="spellStart"/>
-      <w:r>
-        <w:t>bash</w:t>
+        <w:t xml:space="preserve"> </w:t>
+      </w:r>
+      <w:proofErr w:type="spellStart"/>
+      <w:r>
+        <w:t>build</w:t>
+      </w:r>
+      <w:proofErr w:type="spellEnd"/>
+      <w:r>
+        <w:t xml:space="preserve"> -t </w:t>
+      </w:r>
+      <w:proofErr w:type="spellStart"/>
+      <w:r>
+        <w:t>miweb</w:t>
+      </w:r>
+      <w:proofErr w:type="spellEnd"/>
+      <w:r>
+        <w:t xml:space="preserve"> /home/pc-profe/</w:t>
+      </w:r>
+      <w:proofErr w:type="spellStart"/>
+      <w:r>
+        <w:t>miweb</w:t>
+      </w:r>
+      <w:proofErr w:type="spellEnd"/>
+    </w:p>
+    <w:p>
+      <w:r>
+        <w:t xml:space="preserve">- Se ve que se ha creado satisfactoriamente con </w:t>
+      </w:r>
+      <w:proofErr w:type="spellStart"/>
+      <w:r>
+        <w:t>docker</w:t>
+      </w:r>
+      <w:proofErr w:type="spellEnd"/>
+      <w:r>
+        <w:t xml:space="preserve"> </w:t>
+      </w:r>
+      <w:proofErr w:type="spellStart"/>
+      <w:r>
+        <w:t>images</w:t>
       </w:r>
       <w:proofErr w:type="spellEnd"/>
     </w:p>
     <w:p/>
     <w:p>
       <w:r>
-        <w:t>Aparecerá el identificador del contenedor:</w:t>
-      </w:r>
-    </w:p>
-    <w:p>
-      <w:r>
-        <w:t>Con otra terminal podemos hacer</w:t>
-      </w:r>
-    </w:p>
-    <w:p>
+        <w:t xml:space="preserve">Ejecutamos la imagen </w:t>
+      </w:r>
+      <w:proofErr w:type="spellStart"/>
+      <w:r>
+        <w:t>miweb</w:t>
+      </w:r>
+      <w:proofErr w:type="spellEnd"/>
+      <w:r>
+        <w:t xml:space="preserve"> con este comando </w:t>
+      </w:r>
       <w:proofErr w:type="spellStart"/>
       <w:r>
         <w:t>docker</w:t>
       </w:r>
       <w:proofErr w:type="spellEnd"/>
       <w:r>
-        <w:t xml:space="preserve"> </w:t>
-      </w:r>
-      <w:proofErr w:type="spellStart"/>
-      <w:r>
-        <w:t>ps</w:t>
-      </w:r>
-      <w:proofErr w:type="spellEnd"/>
-      <w:r>
-        <w:t xml:space="preserve"> -a y ver los estados de los contenedores que se han ejecutado hasta el momento:</w:t>
-      </w:r>
+        <w:t xml:space="preserve"> run -d -p 85:80 </w:t>
+      </w:r>
+      <w:proofErr w:type="spellStart"/>
+      <w:r>
+        <w:t>miweb</w:t>
+      </w:r>
+      <w:proofErr w:type="spellEnd"/>
     </w:p>
     <w:p/>
     <w:p>
       <w:r>
-        <w:t xml:space="preserve">Si se ejecuta un comando dentro del contenedor, como </w:t>
-      </w:r>
-      <w:proofErr w:type="spellStart"/>
-      <w:r>
-        <w:t>mkdir</w:t>
-      </w:r>
-      <w:proofErr w:type="spellEnd"/>
-      <w:r>
-        <w:t xml:space="preserve"> pruebas, lo hace, pero cuando termine el contenedor no recordará nada (no es persistente)</w:t>
+        <w:t>- Si ahora entramos en el navegador de nuestro sistema operativo anfitrión y escribimos localhost:85 aparecerá la página de Apache:</w:t>
       </w:r>
     </w:p>
     <w:p/>
     <w:p>
       <w:r>
-        <w:t>Salida de un contenedor:</w:t>
-      </w:r>
-    </w:p>
-    <w:p>
-      <w:proofErr w:type="spellStart"/>
-      <w:r>
-        <w:t>exit</w:t>
-      </w:r>
-      <w:proofErr w:type="spellEnd"/>
-    </w:p>
-    <w:p>
-      <w:r>
-        <w:t xml:space="preserve">Borrado de un contenedor de la lista que sale con </w:t>
+        <w:t>¡Ha funcionado!</w:t>
+      </w:r>
+    </w:p>
+    <w:p>
+      <w:pPr>
+        <w:rPr>
+          <w:b/>
+          <w:bCs/>
+        </w:rPr>
+      </w:pPr>
+      <w:r>
+        <w:rPr>
+          <w:b/>
+          <w:bCs/>
+        </w:rPr>
+        <w:br w:type="page"/>
+      </w:r>
+    </w:p>
+    <w:p>
+      <w:pPr>
+        <w:pStyle w:val="Ttulo1"/>
+        <w:jc w:val="center"/>
+      </w:pPr>
+      <w:r>
+        <w:lastRenderedPageBreak/>
+        <w:t>PROBLEMA IMPORTANTE EN VERSIONES FUTURAS DE DOCKER:</w:t>
+      </w:r>
+    </w:p>
+    <w:p>
+      <w:r>
+        <w:t>Si te has fijado, antes de crear la imagen, se avisa de que esta forma de construir una imagen está descontinuada (</w:t>
+      </w:r>
+      <w:proofErr w:type="spellStart"/>
+      <w:r>
+        <w:t>deprecated</w:t>
+      </w:r>
+      <w:proofErr w:type="spellEnd"/>
+      <w:r>
+        <w:t>), y que será eliminada esta forma de trabajar en futuras versiones. Por ello vamos a instalar la versión oficial de Docker y a usar el método nuevo que recomiendan:</w:t>
+      </w:r>
+    </w:p>
+    <w:p>
+      <w:r>
+        <w:t xml:space="preserve">sudo </w:t>
+      </w:r>
+      <w:proofErr w:type="spellStart"/>
+      <w:r>
+        <w:t>apt</w:t>
+      </w:r>
+      <w:proofErr w:type="spellEnd"/>
+      <w:r>
+        <w:t xml:space="preserve"> </w:t>
+      </w:r>
+      <w:proofErr w:type="spellStart"/>
+      <w:r>
+        <w:t>remove</w:t>
+      </w:r>
+      <w:proofErr w:type="spellEnd"/>
+      <w:r>
+        <w:t xml:space="preserve"> docker.io # Elimina la versión antigua</w:t>
+      </w:r>
+    </w:p>
+    <w:p>
+      <w:r>
+        <w:t xml:space="preserve">sudo </w:t>
+      </w:r>
+      <w:proofErr w:type="spellStart"/>
+      <w:r>
+        <w:t>apt</w:t>
+      </w:r>
+      <w:proofErr w:type="spellEnd"/>
+      <w:r>
+        <w:t xml:space="preserve"> </w:t>
+      </w:r>
+      <w:proofErr w:type="spellStart"/>
+      <w:r>
+        <w:t>update</w:t>
+      </w:r>
+      <w:proofErr w:type="spellEnd"/>
+    </w:p>
+    <w:p>
+      <w:r>
+        <w:t xml:space="preserve">sudo </w:t>
+      </w:r>
+      <w:proofErr w:type="spellStart"/>
+      <w:r>
+        <w:t>apt</w:t>
+      </w:r>
+      <w:proofErr w:type="spellEnd"/>
+      <w:r>
+        <w:t xml:space="preserve"> </w:t>
+      </w:r>
+      <w:proofErr w:type="spellStart"/>
+      <w:r>
+        <w:t>install</w:t>
+      </w:r>
+      <w:proofErr w:type="spellEnd"/>
+      <w:r>
+        <w:t xml:space="preserve"> ca-</w:t>
+      </w:r>
+      <w:proofErr w:type="spellStart"/>
+      <w:r>
+        <w:t>certificates</w:t>
+      </w:r>
+      <w:proofErr w:type="spellEnd"/>
+      <w:r>
+        <w:t xml:space="preserve"> </w:t>
+      </w:r>
+      <w:proofErr w:type="spellStart"/>
+      <w:r>
+        <w:t>curl</w:t>
+      </w:r>
+      <w:proofErr w:type="spellEnd"/>
+      <w:r>
+        <w:t xml:space="preserve"> </w:t>
+      </w:r>
+      <w:proofErr w:type="spellStart"/>
+      <w:r>
+        <w:t>gnupg</w:t>
+      </w:r>
+      <w:proofErr w:type="spellEnd"/>
+    </w:p>
+    <w:p/>
+    <w:p>
+      <w:r>
+        <w:t># Agregar la clave GPG oficial de Docker</w:t>
+      </w:r>
+    </w:p>
+    <w:p>
+      <w:r>
+        <w:t xml:space="preserve">sudo </w:t>
+      </w:r>
+      <w:proofErr w:type="spellStart"/>
+      <w:r>
+        <w:t>install</w:t>
+      </w:r>
+      <w:proofErr w:type="spellEnd"/>
+      <w:r>
+        <w:t xml:space="preserve"> -m 0755 -d /</w:t>
+      </w:r>
+      <w:proofErr w:type="spellStart"/>
+      <w:r>
+        <w:t>etc</w:t>
+      </w:r>
+      <w:proofErr w:type="spellEnd"/>
+      <w:r>
+        <w:t>/</w:t>
+      </w:r>
+      <w:proofErr w:type="spellStart"/>
+      <w:r>
+        <w:t>apt</w:t>
+      </w:r>
+      <w:proofErr w:type="spellEnd"/>
+      <w:r>
+        <w:t>/</w:t>
+      </w:r>
+      <w:proofErr w:type="spellStart"/>
+      <w:r>
+        <w:t>keyrings</w:t>
+      </w:r>
+      <w:proofErr w:type="spellEnd"/>
+    </w:p>
+    <w:p>
+      <w:proofErr w:type="spellStart"/>
+      <w:r>
+        <w:t>curl</w:t>
+      </w:r>
+      <w:proofErr w:type="spellEnd"/>
+      <w:r>
+        <w:t xml:space="preserve"> -</w:t>
+      </w:r>
+      <w:proofErr w:type="spellStart"/>
+      <w:r>
+        <w:t>fsSL</w:t>
+      </w:r>
+      <w:proofErr w:type="spellEnd"/>
+      <w:r>
+        <w:t xml:space="preserve"> https://download.docker.com/linux/ubuntu/gpg | sudo </w:t>
+      </w:r>
+      <w:proofErr w:type="spellStart"/>
+      <w:r>
+        <w:t>tee</w:t>
+      </w:r>
+      <w:proofErr w:type="spellEnd"/>
+      <w:r>
+        <w:t xml:space="preserve"> /</w:t>
+      </w:r>
+      <w:proofErr w:type="spellStart"/>
+      <w:r>
+        <w:t>etc</w:t>
+      </w:r>
+      <w:proofErr w:type="spellEnd"/>
+      <w:r>
+        <w:t>/</w:t>
+      </w:r>
+      <w:proofErr w:type="spellStart"/>
+      <w:r>
+        <w:t>apt</w:t>
+      </w:r>
+      <w:proofErr w:type="spellEnd"/>
+      <w:r>
+        <w:t>/</w:t>
+      </w:r>
+      <w:proofErr w:type="spellStart"/>
+      <w:r>
+        <w:t>keyrings</w:t>
+      </w:r>
+      <w:proofErr w:type="spellEnd"/>
+      <w:r>
+        <w:t>/</w:t>
+      </w:r>
+      <w:proofErr w:type="spellStart"/>
+      <w:r>
+        <w:t>docker.asc</w:t>
+      </w:r>
+      <w:proofErr w:type="spellEnd"/>
+      <w:r>
+        <w:t xml:space="preserve"> &gt; /</w:t>
+      </w:r>
+      <w:proofErr w:type="spellStart"/>
+      <w:r>
+        <w:t>dev</w:t>
+      </w:r>
+      <w:proofErr w:type="spellEnd"/>
+      <w:r>
+        <w:t>/</w:t>
+      </w:r>
+      <w:proofErr w:type="spellStart"/>
+      <w:r>
+        <w:t>null</w:t>
+      </w:r>
+      <w:proofErr w:type="spellEnd"/>
+    </w:p>
+    <w:p>
+      <w:r>
+        <w:t xml:space="preserve">sudo </w:t>
+      </w:r>
+      <w:proofErr w:type="spellStart"/>
+      <w:r>
+        <w:t>chmod</w:t>
+      </w:r>
+      <w:proofErr w:type="spellEnd"/>
+      <w:r>
+        <w:t xml:space="preserve"> </w:t>
+      </w:r>
+      <w:proofErr w:type="spellStart"/>
+      <w:r>
+        <w:t>a+r</w:t>
+      </w:r>
+      <w:proofErr w:type="spellEnd"/>
+      <w:r>
+        <w:t xml:space="preserve"> /</w:t>
+      </w:r>
+      <w:proofErr w:type="spellStart"/>
+      <w:r>
+        <w:t>etc</w:t>
+      </w:r>
+      <w:proofErr w:type="spellEnd"/>
+      <w:r>
+        <w:t>/</w:t>
+      </w:r>
+      <w:proofErr w:type="spellStart"/>
+      <w:r>
+        <w:t>apt</w:t>
+      </w:r>
+      <w:proofErr w:type="spellEnd"/>
+      <w:r>
+        <w:t>/</w:t>
+      </w:r>
+      <w:proofErr w:type="spellStart"/>
+      <w:r>
+        <w:t>keyrings</w:t>
+      </w:r>
+      <w:proofErr w:type="spellEnd"/>
+      <w:r>
+        <w:t>/</w:t>
+      </w:r>
+      <w:proofErr w:type="spellStart"/>
+      <w:r>
+        <w:t>docker.asc</w:t>
+      </w:r>
+      <w:proofErr w:type="spellEnd"/>
+    </w:p>
+    <w:p/>
+    <w:p>
+      <w:r>
+        <w:t># Agregar el repositorio oficial de Docker</w:t>
+      </w:r>
+    </w:p>
+    <w:p>
+      <w:r>
+        <w:t>echo \</w:t>
+      </w:r>
+    </w:p>
+    <w:p>
+      <w:r>
+        <w:t>"</w:t>
+      </w:r>
+      <w:proofErr w:type="spellStart"/>
+      <w:r>
+        <w:t>deb</w:t>
+      </w:r>
+      <w:proofErr w:type="spellEnd"/>
+      <w:r>
+        <w:t xml:space="preserve"> [</w:t>
+      </w:r>
+      <w:proofErr w:type="spellStart"/>
+      <w:r>
+        <w:t>arch</w:t>
+      </w:r>
+      <w:proofErr w:type="spellEnd"/>
+      <w:r>
+        <w:t>=$(</w:t>
+      </w:r>
+      <w:proofErr w:type="spellStart"/>
+      <w:r>
+        <w:t>dpkg</w:t>
+      </w:r>
+      <w:proofErr w:type="spellEnd"/>
+      <w:r>
+        <w:t xml:space="preserve"> --</w:t>
+      </w:r>
+      <w:proofErr w:type="spellStart"/>
+      <w:r>
+        <w:t>print-architecture</w:t>
+      </w:r>
+      <w:proofErr w:type="spellEnd"/>
+      <w:r>
+        <w:t xml:space="preserve">) </w:t>
+      </w:r>
+      <w:proofErr w:type="spellStart"/>
+      <w:r>
+        <w:t>signed-by</w:t>
+      </w:r>
+      <w:proofErr w:type="spellEnd"/>
+      <w:r>
+        <w:t>=/</w:t>
+      </w:r>
+      <w:proofErr w:type="spellStart"/>
+      <w:r>
+        <w:t>etc</w:t>
+      </w:r>
+      <w:proofErr w:type="spellEnd"/>
+      <w:r>
+        <w:t>/</w:t>
+      </w:r>
+      <w:proofErr w:type="spellStart"/>
+      <w:r>
+        <w:t>apt</w:t>
+      </w:r>
+      <w:proofErr w:type="spellEnd"/>
+      <w:r>
+        <w:t>/</w:t>
+      </w:r>
+      <w:proofErr w:type="spellStart"/>
+      <w:r>
+        <w:t>keyrings</w:t>
+      </w:r>
+      <w:proofErr w:type="spellEnd"/>
+      <w:r>
+        <w:t>/</w:t>
+      </w:r>
+      <w:proofErr w:type="spellStart"/>
+      <w:r>
+        <w:t>docker.asc</w:t>
+      </w:r>
+      <w:proofErr w:type="spellEnd"/>
+      <w:r>
+        <w:t>] https://download.docker.com/linux/ubuntu \</w:t>
+      </w:r>
+    </w:p>
+    <w:p>
+      <w:r>
+        <w:t>$(</w:t>
+      </w:r>
+      <w:proofErr w:type="spellStart"/>
+      <w:r>
+        <w:t>lsb_release</w:t>
+      </w:r>
+      <w:proofErr w:type="spellEnd"/>
+      <w:r>
+        <w:t xml:space="preserve"> -</w:t>
+      </w:r>
+      <w:proofErr w:type="spellStart"/>
+      <w:r>
+        <w:t>cs</w:t>
+      </w:r>
+      <w:proofErr w:type="spellEnd"/>
+      <w:r>
+        <w:t xml:space="preserve">) </w:t>
+      </w:r>
+      <w:proofErr w:type="spellStart"/>
+      <w:r>
+        <w:t>stable</w:t>
+      </w:r>
+      <w:proofErr w:type="spellEnd"/>
+      <w:r>
+        <w:t xml:space="preserve">" | sudo </w:t>
+      </w:r>
+      <w:proofErr w:type="spellStart"/>
+      <w:r>
+        <w:t>tee</w:t>
+      </w:r>
+      <w:proofErr w:type="spellEnd"/>
+      <w:r>
+        <w:t xml:space="preserve"> /</w:t>
+      </w:r>
+      <w:proofErr w:type="spellStart"/>
+      <w:r>
+        <w:t>etc</w:t>
+      </w:r>
+      <w:proofErr w:type="spellEnd"/>
+      <w:r>
+        <w:t>/</w:t>
+      </w:r>
+      <w:proofErr w:type="spellStart"/>
+      <w:r>
+        <w:t>apt</w:t>
+      </w:r>
+      <w:proofErr w:type="spellEnd"/>
+      <w:r>
+        <w:t>/</w:t>
+      </w:r>
+      <w:proofErr w:type="spellStart"/>
+      <w:r>
+        <w:t>sources.list.d</w:t>
+      </w:r>
+      <w:proofErr w:type="spellEnd"/>
+      <w:r>
+        <w:t>/</w:t>
+      </w:r>
+      <w:proofErr w:type="spellStart"/>
+      <w:r>
+        <w:t>docker.list</w:t>
+      </w:r>
+      <w:proofErr w:type="spellEnd"/>
+      <w:r>
+        <w:t xml:space="preserve"> &gt; /</w:t>
+      </w:r>
+      <w:proofErr w:type="spellStart"/>
+      <w:r>
+        <w:t>dev</w:t>
+      </w:r>
+      <w:proofErr w:type="spellEnd"/>
+      <w:r>
+        <w:t>/</w:t>
+      </w:r>
+      <w:proofErr w:type="spellStart"/>
+      <w:r>
+        <w:t>null</w:t>
+      </w:r>
+      <w:proofErr w:type="spellEnd"/>
+    </w:p>
+    <w:p/>
+    <w:p>
+      <w:r>
+        <w:t xml:space="preserve">sudo </w:t>
+      </w:r>
+      <w:proofErr w:type="spellStart"/>
+      <w:r>
+        <w:t>apt</w:t>
+      </w:r>
+      <w:proofErr w:type="spellEnd"/>
+      <w:r>
+        <w:t xml:space="preserve"> </w:t>
+      </w:r>
+      <w:proofErr w:type="spellStart"/>
+      <w:r>
+        <w:t>update</w:t>
+      </w:r>
+      <w:proofErr w:type="spellEnd"/>
+    </w:p>
+    <w:p>
+      <w:r>
+        <w:t xml:space="preserve">sudo </w:t>
+      </w:r>
+      <w:proofErr w:type="spellStart"/>
+      <w:r>
+        <w:t>apt</w:t>
+      </w:r>
+      <w:proofErr w:type="spellEnd"/>
+      <w:r>
+        <w:t xml:space="preserve"> </w:t>
+      </w:r>
+      <w:proofErr w:type="spellStart"/>
+      <w:r>
+        <w:t>install</w:t>
+      </w:r>
+      <w:proofErr w:type="spellEnd"/>
+      <w:r>
+        <w:t xml:space="preserve"> </w:t>
       </w:r>
       <w:proofErr w:type="spellStart"/>
       <w:r>
@@ -1405,41 +3160,23 @@
       </w:r>
       <w:proofErr w:type="spellEnd"/>
       <w:r>
-        <w:t xml:space="preserve"> </w:t>
-      </w:r>
-      <w:proofErr w:type="spellStart"/>
-      <w:r>
-        <w:t>ps</w:t>
-      </w:r>
-      <w:proofErr w:type="spellEnd"/>
-      <w:r>
-        <w:t xml:space="preserve"> -a</w:t>
-      </w:r>
-    </w:p>
-    <w:p>
+        <w:t xml:space="preserve">-ce </w:t>
+      </w:r>
       <w:proofErr w:type="spellStart"/>
       <w:r>
         <w:t>docker</w:t>
       </w:r>
       <w:proofErr w:type="spellEnd"/>
       <w:r>
-        <w:t xml:space="preserve"> </w:t>
-      </w:r>
-      <w:proofErr w:type="spellStart"/>
-      <w:r>
-        <w:t>rm</w:t>
-      </w:r>
-      <w:proofErr w:type="spellEnd"/>
-      <w:r>
-        <w:t xml:space="preserve"> </w:t>
-      </w:r>
-      <w:proofErr w:type="spellStart"/>
-      <w:r>
-        <w:t>id_contenedor</w:t>
-      </w:r>
-      <w:proofErr w:type="spellEnd"/>
-      <w:r>
-        <w:t xml:space="preserve"> Ej: </w:t>
+        <w:t>-ce-</w:t>
+      </w:r>
+      <w:proofErr w:type="spellStart"/>
+      <w:r>
+        <w:t>cli</w:t>
+      </w:r>
+      <w:proofErr w:type="spellEnd"/>
+      <w:r>
+        <w:t xml:space="preserve"> containerd.io </w:t>
       </w:r>
       <w:proofErr w:type="spellStart"/>
       <w:r>
@@ -1447,20 +3184,82 @@
       </w:r>
       <w:proofErr w:type="spellEnd"/>
       <w:r>
-        <w:t xml:space="preserve"> </w:t>
-      </w:r>
-      <w:proofErr w:type="spellStart"/>
-      <w:r>
-        <w:t>rm</w:t>
-      </w:r>
-      <w:proofErr w:type="spellEnd"/>
-      <w:r>
-        <w:t xml:space="preserve"> a5</w:t>
+        <w:t>-</w:t>
+      </w:r>
+      <w:proofErr w:type="spellStart"/>
+      <w:r>
+        <w:t>buildx</w:t>
+      </w:r>
+      <w:proofErr w:type="spellEnd"/>
+      <w:r>
+        <w:t>-plugin</w:t>
+      </w:r>
+    </w:p>
+    <w:p/>
+    <w:p>
+      <w:r>
+        <w:t>Con esto se elimina la versión no oficial que se instaló al principio del tutorial, docker.io, y se instala la última versión oficial de Docker.</w:t>
+      </w:r>
+    </w:p>
+    <w:p>
+      <w:r>
+        <w:t>Ahora hay que iniciar el servidor Docker, con</w:t>
+      </w:r>
+    </w:p>
+    <w:p>
+      <w:proofErr w:type="spellStart"/>
+      <w:r>
+        <w:t>service</w:t>
+      </w:r>
+      <w:proofErr w:type="spellEnd"/>
+      <w:r>
+        <w:t xml:space="preserve"> </w:t>
+      </w:r>
+      <w:proofErr w:type="spellStart"/>
+      <w:r>
+        <w:t>docker</w:t>
+      </w:r>
+      <w:proofErr w:type="spellEnd"/>
+      <w:r>
+        <w:t xml:space="preserve"> </w:t>
+      </w:r>
+      <w:proofErr w:type="spellStart"/>
+      <w:r>
+        <w:t>start</w:t>
+      </w:r>
+      <w:proofErr w:type="spellEnd"/>
+    </w:p>
+    <w:p>
+      <w:proofErr w:type="spellStart"/>
+      <w:r>
+        <w:t>service</w:t>
+      </w:r>
+      <w:proofErr w:type="spellEnd"/>
+      <w:r>
+        <w:t xml:space="preserve"> </w:t>
+      </w:r>
+      <w:proofErr w:type="spellStart"/>
+      <w:r>
+        <w:t>docker</w:t>
+      </w:r>
+      <w:proofErr w:type="spellEnd"/>
+      <w:r>
+        <w:t xml:space="preserve"> status</w:t>
+      </w:r>
+    </w:p>
+    <w:p/>
+    <w:p/>
+    <w:p/>
+    <w:p/>
+    <w:p/>
+    <w:p>
+      <w:r>
+        <w:br w:type="page"/>
       </w:r>
     </w:p>
     <w:p/>
     <w:sectPr>
-      <w:footerReference w:type="default" r:id="rId18"/>
+      <w:footerReference w:type="default" r:id="rId28"/>
       <w:pgSz w:w="11906" w:h="16838"/>
       <w:pgMar w:top="1417" w:right="1701" w:bottom="1417" w:left="1701" w:header="708" w:footer="708" w:gutter="0"/>
       <w:cols w:space="708"/>
@@ -2753,4 +4552,16 @@
     </a:ext>
   </a:extLst>
 </a:theme>
+</file>
+
+<file path=customXml/item1.xml><?xml version="1.0" encoding="utf-8"?>
+<b:Sources xmlns:b="http://schemas.openxmlformats.org/officeDocument/2006/bibliography" xmlns="http://schemas.openxmlformats.org/officeDocument/2006/bibliography" SelectedStyle="\APASixthEditionOfficeOnline.xsl" StyleName="APA" Version="6"/>
+</file>
+
+<file path=customXml/itemProps1.xml><?xml version="1.0" encoding="utf-8"?>
+<ds:datastoreItem xmlns:ds="http://schemas.openxmlformats.org/officeDocument/2006/customXml" ds:itemID="{A99DF185-64EE-452D-B5EF-2027142B9EEA}">
+  <ds:schemaRefs>
+    <ds:schemaRef ds:uri="http://schemas.openxmlformats.org/officeDocument/2006/bibliography"/>
+  </ds:schemaRefs>
+</ds:datastoreItem>
 </file>
</xml_diff>